<commit_message>
Add matlab exercises, reorganize word
</commit_message>
<xml_diff>
--- a/1_Introduction_To_Linear_Algebra.docx
+++ b/1_Introduction_To_Linear_Algebra.docx
@@ -21,8 +21,20 @@
       <w:pPr>
         <w:pStyle w:val="Heading1"/>
         <w:rPr>
-          <w:b/>
-          <w:bCs/>
+          <w:lang w:val="en-US"/>
+        </w:rPr>
+      </w:pPr>
+      <w:r>
+        <w:rPr>
+          <w:lang w:val="en-US"/>
+        </w:rPr>
+        <w:t>Chapter 1.2</w:t>
+      </w:r>
+    </w:p>
+    <w:p>
+      <w:pPr>
+        <w:pStyle w:val="Heading2"/>
+        <w:rPr>
           <w:lang w:val="en-US"/>
         </w:rPr>
       </w:pPr>
@@ -53,30 +65,14 @@
             <w:rFonts w:ascii="Cambria Math" w:hAnsi="Cambria Math"/>
             <w:lang w:val="en-US"/>
           </w:rPr>
-          <m:t>u</m:t>
-        </m:r>
-        <m:r>
-          <w:rPr>
-            <w:rFonts w:ascii="Cambria Math" w:hAnsi="Cambria Math"/>
-            <w:lang w:val="en-US"/>
-          </w:rPr>
-          <m:t>∙</m:t>
-        </m:r>
-        <m:r>
-          <m:rPr>
-            <m:sty m:val="bi"/>
-          </m:rPr>
-          <w:rPr>
-            <w:rFonts w:ascii="Cambria Math" w:hAnsi="Cambria Math"/>
-            <w:lang w:val="en-US"/>
-          </w:rPr>
-          <m:t>v</m:t>
+          <m:t>u∙v</m:t>
         </m:r>
       </m:oMath>
     </w:p>
     <w:p>
       <w:pPr>
         <w:ind w:firstLine="708"/>
+        <w:jc w:val="both"/>
         <w:rPr>
           <w:lang w:val="en-US"/>
         </w:rPr>
@@ -316,7 +312,7 @@
               <w:rFonts w:ascii="Cambria Math" w:eastAsiaTheme="minorEastAsia" w:hAnsi="Cambria Math"/>
               <w:lang w:val="en-US"/>
             </w:rPr>
-            <m:t>+…</m:t>
+            <m:t>+…+</m:t>
           </m:r>
           <m:sSub>
             <m:sSubPr>
@@ -710,16 +706,81 @@
     </w:p>
     <w:p>
       <w:pPr>
+        <w:pStyle w:val="Heading3"/>
+        <w:rPr>
+          <w:rFonts w:eastAsiaTheme="minorEastAsia"/>
+          <w:lang w:val="en-US"/>
+        </w:rPr>
+      </w:pPr>
+      <w:r>
+        <w:rPr>
+          <w:rFonts w:eastAsiaTheme="minorEastAsia"/>
+          <w:lang w:val="en-US"/>
+        </w:rPr>
+        <w:t>Vector difference triangle</w:t>
+      </w:r>
+    </w:p>
+    <w:p>
+      <w:pPr>
+        <w:ind w:firstLine="708"/>
+        <w:jc w:val="both"/>
+        <w:rPr>
+          <w:rFonts w:eastAsiaTheme="minorEastAsia"/>
+          <w:lang w:val="en-US"/>
+        </w:rPr>
+      </w:pPr>
+      <w:r>
+        <w:rPr>
+          <w:lang w:val="en-US"/>
+        </w:rPr>
+        <w:t xml:space="preserve">We will begin by analyzing the significance of the cosine of the angle </w:t>
+      </w:r>
+      <m:oMath>
+        <m:r>
+          <w:rPr>
+            <w:rFonts w:ascii="Cambria Math" w:hAnsi="Cambria Math"/>
+            <w:lang w:val="en-US"/>
+          </w:rPr>
+          <m:t>α</m:t>
+        </m:r>
+      </m:oMath>
+      <w:r>
+        <w:rPr>
+          <w:rFonts w:eastAsiaTheme="minorEastAsia"/>
+          <w:lang w:val="en-US"/>
+        </w:rPr>
+        <w:t xml:space="preserve">. The angle is not inside a right </w:t>
+      </w:r>
+      <w:r>
+        <w:rPr>
+          <w:rFonts w:eastAsiaTheme="minorEastAsia"/>
+          <w:lang w:val="en-US"/>
+        </w:rPr>
+        <w:t>triangle</w:t>
+      </w:r>
+      <w:r>
+        <w:rPr>
+          <w:rFonts w:eastAsiaTheme="minorEastAsia"/>
+          <w:lang w:val="en-US"/>
+        </w:rPr>
+        <w:t xml:space="preserve"> thus we cannot compute any trigonometric function for it.</w:t>
+      </w:r>
+    </w:p>
+    <w:p>
+      <w:pPr>
+        <w:ind w:firstLine="708"/>
         <w:jc w:val="center"/>
         <w:rPr>
+          <w:rFonts w:eastAsiaTheme="minorEastAsia"/>
           <w:lang w:val="en-US"/>
         </w:rPr>
       </w:pPr>
       <w:r>
         <w:rPr>
-          <w:lang w:val="en-US"/>
-        </w:rPr>
-        <w:object w:dxaOrig="2967" w:dyaOrig="2397" w14:anchorId="3A15A775">
+          <w:rFonts w:eastAsiaTheme="minorEastAsia"/>
+          <w:lang w:val="en-US"/>
+        </w:rPr>
+        <w:object w:dxaOrig="2967" w:dyaOrig="2397" w14:anchorId="3F257D9A">
           <v:shapetype id="_x0000_t75" coordsize="21600,21600" o:spt="75" o:preferrelative="t" path="m@4@5l@4@11@9@11@9@5xe" filled="f" stroked="f">
             <v:stroke joinstyle="miter"/>
             <v:formulas>
@@ -739,52 +800,121 @@
             <v:path o:extrusionok="f" gradientshapeok="t" o:connecttype="rect"/>
             <o:lock v:ext="edit" aspectratio="t"/>
           </v:shapetype>
-          <v:shape id="_x0000_i1025" type="#_x0000_t75" style="width:233.25pt;height:189pt" o:ole="">
+          <v:shape id="_x0000_i1025" type="#_x0000_t75" style="width:187.2pt;height:184.05pt" o:ole="">
             <v:imagedata r:id="rId6" o:title=""/>
           </v:shape>
-          <o:OLEObject Type="Embed" ProgID="AxGlyph.Document" ShapeID="_x0000_i1025" DrawAspect="Content" ObjectID="_1821804070" r:id="rId7"/>
+          <o:OLEObject Type="Embed" ProgID="AxGlyph.Document" ShapeID="_x0000_i1025" DrawAspect="Content" ObjectID="_1830868618" r:id="rId7"/>
         </w:object>
-      </w:r>
-    </w:p>
-    <w:p>
-      <w:pPr>
-        <w:pStyle w:val="Heading2"/>
-        <w:rPr>
-          <w:rFonts w:eastAsiaTheme="minorEastAsia"/>
-          <w:lang w:val="en-US"/>
-        </w:rPr>
-      </w:pPr>
-      <w:r>
-        <w:rPr>
-          <w:rFonts w:eastAsiaTheme="minorEastAsia"/>
-          <w:lang w:val="en-US"/>
-        </w:rPr>
-        <w:t>The Law of Cosines</w:t>
       </w:r>
     </w:p>
     <w:p>
       <w:pPr>
         <w:ind w:firstLine="708"/>
-        <w:rPr>
+        <w:jc w:val="both"/>
+        <w:rPr>
+          <w:rFonts w:eastAsiaTheme="minorEastAsia"/>
           <w:lang w:val="en-US"/>
         </w:rPr>
       </w:pPr>
       <w:r>
         <w:rPr>
-          <w:lang w:val="en-US"/>
-        </w:rPr>
-        <w:t>Based on the figure above we can write the following expressions</w:t>
-      </w:r>
-      <w:r>
-        <w:rPr>
-          <w:lang w:val="en-US"/>
-        </w:rPr>
-        <w:t>:</w:t>
+          <w:rFonts w:eastAsiaTheme="minorEastAsia"/>
+          <w:lang w:val="en-US"/>
+        </w:rPr>
+        <w:t>What we can do is form two right triangle</w:t>
+      </w:r>
+      <w:r>
+        <w:rPr>
+          <w:rFonts w:eastAsiaTheme="minorEastAsia"/>
+          <w:lang w:val="en-US"/>
+        </w:rPr>
+        <w:t>s</w:t>
+      </w:r>
+      <w:r>
+        <w:rPr>
+          <w:rFonts w:eastAsiaTheme="minorEastAsia"/>
+          <w:lang w:val="en-US"/>
+        </w:rPr>
+        <w:t xml:space="preserve"> by drawing both the segment from </w:t>
+      </w:r>
+      <m:oMath>
+        <m:r>
+          <m:rPr>
+            <m:sty m:val="bi"/>
+          </m:rPr>
+          <w:rPr>
+            <w:rFonts w:ascii="Cambria Math" w:eastAsiaTheme="minorEastAsia" w:hAnsi="Cambria Math"/>
+            <w:lang w:val="en-US"/>
+          </w:rPr>
+          <m:t>v</m:t>
+        </m:r>
+      </m:oMath>
+      <w:r>
+        <w:rPr>
+          <w:rFonts w:eastAsiaTheme="minorEastAsia"/>
+          <w:lang w:val="en-US"/>
+        </w:rPr>
+        <w:t xml:space="preserve"> to </w:t>
+      </w:r>
+      <m:oMath>
+        <m:r>
+          <m:rPr>
+            <m:sty m:val="bi"/>
+          </m:rPr>
+          <w:rPr>
+            <w:rFonts w:ascii="Cambria Math" w:eastAsiaTheme="minorEastAsia" w:hAnsi="Cambria Math"/>
+            <w:lang w:val="en-US"/>
+          </w:rPr>
+          <m:t>u</m:t>
+        </m:r>
+      </m:oMath>
+      <w:r>
+        <w:rPr>
+          <w:rFonts w:eastAsiaTheme="minorEastAsia"/>
+          <w:b/>
+          <w:bCs/>
+          <w:lang w:val="en-US"/>
+        </w:rPr>
+        <w:t xml:space="preserve"> </w:t>
+      </w:r>
+      <w:r>
+        <w:rPr>
+          <w:rFonts w:eastAsiaTheme="minorEastAsia"/>
+          <w:lang w:val="en-US"/>
+        </w:rPr>
+        <w:t>and the</w:t>
+      </w:r>
+      <w:r>
+        <w:rPr>
+          <w:rFonts w:eastAsiaTheme="minorEastAsia"/>
+          <w:lang w:val="en-US"/>
+        </w:rPr>
+        <w:t xml:space="preserve"> altitude from </w:t>
+      </w:r>
+      <m:oMath>
+        <m:r>
+          <m:rPr>
+            <m:sty m:val="bi"/>
+          </m:rPr>
+          <w:rPr>
+            <w:rFonts w:ascii="Cambria Math" w:eastAsiaTheme="minorEastAsia" w:hAnsi="Cambria Math"/>
+            <w:lang w:val="en-US"/>
+          </w:rPr>
+          <m:t>u</m:t>
+        </m:r>
+      </m:oMath>
+      <w:r>
+        <w:rPr>
+          <w:rFonts w:eastAsiaTheme="minorEastAsia"/>
+          <w:lang w:val="en-US"/>
+        </w:rPr>
+        <w:t xml:space="preserve"> as in the figure below.</w:t>
       </w:r>
     </w:p>
     <w:p>
       <w:pPr>
         <w:ind w:firstLine="708"/>
+        <w:jc w:val="both"/>
         <w:rPr>
           <w:rFonts w:eastAsiaTheme="minorEastAsia"/>
           <w:lang w:val="en-US"/>
@@ -792,6 +922,473 @@
       </w:pPr>
       <w:r>
         <w:rPr>
+          <w:rFonts w:eastAsiaTheme="minorEastAsia"/>
+          <w:lang w:val="en-US"/>
+        </w:rPr>
+        <w:t>Usually, when drawing vectors, we need to respect the convention that the arrow starts at the “origin” of the coordinate system. This is true if we want to have a 1-to-1 interpretation of the numerical form of a column vector. In practice we can change the “origin” of our vectors without loosing the column vector meaning. The column vector (1,1) drawn from the origin to the point (1,1) is the same vector as the one drawn from (4,5) to (5,6)</w:t>
+      </w:r>
+      <w:r>
+        <w:rPr>
+          <w:rFonts w:eastAsiaTheme="minorEastAsia"/>
+          <w:lang w:val="en-US"/>
+        </w:rPr>
+        <w:t>. It is still a vector with components (1,1).</w:t>
+      </w:r>
+      <w:r>
+        <w:rPr>
+          <w:rFonts w:eastAsiaTheme="minorEastAsia"/>
+          <w:lang w:val="en-US"/>
+        </w:rPr>
+        <w:t xml:space="preserve"> The vectors </w:t>
+      </w:r>
+      <m:oMath>
+        <m:r>
+          <m:rPr>
+            <m:sty m:val="bi"/>
+          </m:rPr>
+          <w:rPr>
+            <w:rFonts w:ascii="Cambria Math" w:eastAsiaTheme="minorEastAsia" w:hAnsi="Cambria Math"/>
+            <w:lang w:val="en-US"/>
+          </w:rPr>
+          <m:t>v</m:t>
+        </m:r>
+      </m:oMath>
+      <w:r>
+        <w:rPr>
+          <w:rFonts w:eastAsiaTheme="minorEastAsia"/>
+          <w:b/>
+          <w:bCs/>
+          <w:lang w:val="en-US"/>
+        </w:rPr>
+        <w:t xml:space="preserve"> </w:t>
+      </w:r>
+      <w:r>
+        <w:rPr>
+          <w:rFonts w:eastAsiaTheme="minorEastAsia"/>
+          <w:lang w:val="en-US"/>
+        </w:rPr>
+        <w:t xml:space="preserve">and </w:t>
+      </w:r>
+      <m:oMath>
+        <m:r>
+          <m:rPr>
+            <m:sty m:val="bi"/>
+          </m:rPr>
+          <w:rPr>
+            <w:rFonts w:ascii="Cambria Math" w:eastAsiaTheme="minorEastAsia" w:hAnsi="Cambria Math"/>
+            <w:lang w:val="en-US"/>
+          </w:rPr>
+          <m:t>w</m:t>
+        </m:r>
+      </m:oMath>
+      <w:r>
+        <w:rPr>
+          <w:rFonts w:eastAsiaTheme="minorEastAsia"/>
+          <w:b/>
+          <w:bCs/>
+          <w:lang w:val="en-US"/>
+        </w:rPr>
+        <w:t xml:space="preserve"> </w:t>
+      </w:r>
+      <w:r>
+        <w:rPr>
+          <w:rFonts w:eastAsiaTheme="minorEastAsia"/>
+          <w:lang w:val="en-US"/>
+        </w:rPr>
+        <w:t xml:space="preserve">are equal if </w:t>
+      </w:r>
+      <m:oMath>
+        <m:sSub>
+          <m:sSubPr>
+            <m:ctrlPr>
+              <w:rPr>
+                <w:rFonts w:ascii="Cambria Math" w:eastAsiaTheme="minorEastAsia" w:hAnsi="Cambria Math"/>
+                <w:i/>
+                <w:lang w:val="en-US"/>
+              </w:rPr>
+            </m:ctrlPr>
+          </m:sSubPr>
+          <m:e>
+            <m:r>
+              <w:rPr>
+                <w:rFonts w:ascii="Cambria Math" w:eastAsiaTheme="minorEastAsia" w:hAnsi="Cambria Math"/>
+                <w:lang w:val="en-US"/>
+              </w:rPr>
+              <m:t>v</m:t>
+            </m:r>
+          </m:e>
+          <m:sub>
+            <m:r>
+              <w:rPr>
+                <w:rFonts w:ascii="Cambria Math" w:eastAsiaTheme="minorEastAsia" w:hAnsi="Cambria Math"/>
+                <w:lang w:val="en-US"/>
+              </w:rPr>
+              <m:t>i</m:t>
+            </m:r>
+          </m:sub>
+        </m:sSub>
+        <m:r>
+          <w:rPr>
+            <w:rFonts w:ascii="Cambria Math" w:eastAsiaTheme="minorEastAsia" w:hAnsi="Cambria Math"/>
+            <w:lang w:val="en-US"/>
+          </w:rPr>
+          <m:t>=</m:t>
+        </m:r>
+        <m:sSub>
+          <m:sSubPr>
+            <m:ctrlPr>
+              <w:rPr>
+                <w:rFonts w:ascii="Cambria Math" w:eastAsiaTheme="minorEastAsia" w:hAnsi="Cambria Math"/>
+                <w:i/>
+                <w:lang w:val="en-US"/>
+              </w:rPr>
+            </m:ctrlPr>
+          </m:sSubPr>
+          <m:e>
+            <m:r>
+              <w:rPr>
+                <w:rFonts w:ascii="Cambria Math" w:eastAsiaTheme="minorEastAsia" w:hAnsi="Cambria Math"/>
+                <w:lang w:val="en-US"/>
+              </w:rPr>
+              <m:t>w</m:t>
+            </m:r>
+          </m:e>
+          <m:sub>
+            <m:r>
+              <w:rPr>
+                <w:rFonts w:ascii="Cambria Math" w:eastAsiaTheme="minorEastAsia" w:hAnsi="Cambria Math"/>
+                <w:lang w:val="en-US"/>
+              </w:rPr>
+              <m:t>i</m:t>
+            </m:r>
+          </m:sub>
+        </m:sSub>
+        <m:r>
+          <w:rPr>
+            <w:rFonts w:ascii="Cambria Math" w:eastAsiaTheme="minorEastAsia" w:hAnsi="Cambria Math"/>
+            <w:lang w:val="en-US"/>
+          </w:rPr>
+          <m:t xml:space="preserve"> ∀ i</m:t>
+        </m:r>
+        <m:r>
+          <m:rPr>
+            <m:scr m:val="double-struck"/>
+          </m:rPr>
+          <w:rPr>
+            <w:rFonts w:ascii="Cambria Math" w:eastAsiaTheme="minorEastAsia" w:hAnsi="Cambria Math"/>
+            <w:lang w:val="en-US"/>
+          </w:rPr>
+          <m:t>∈N</m:t>
+        </m:r>
+      </m:oMath>
+      <w:r>
+        <w:rPr>
+          <w:rFonts w:eastAsiaTheme="minorEastAsia"/>
+          <w:lang w:val="en-US"/>
+        </w:rPr>
+        <w:t xml:space="preserve">, thus our two vectors are </w:t>
+      </w:r>
+      <w:r>
+        <w:rPr>
+          <w:rFonts w:eastAsiaTheme="minorEastAsia"/>
+          <w:lang w:val="en-US"/>
+        </w:rPr>
+        <w:lastRenderedPageBreak/>
+        <w:t xml:space="preserve">equal. </w:t>
+      </w:r>
+      <w:r>
+        <w:rPr>
+          <w:rFonts w:eastAsiaTheme="minorEastAsia"/>
+          <w:lang w:val="en-US"/>
+        </w:rPr>
+        <w:t xml:space="preserve">That being said, it comes very handy to be able to change the vector’s “origin” in our drawings when doing vector summation. In the figure below, we’ve moved the vector </w:t>
+      </w:r>
+      <m:oMath>
+        <m:r>
+          <m:rPr>
+            <m:sty m:val="bi"/>
+          </m:rPr>
+          <w:rPr>
+            <w:rFonts w:ascii="Cambria Math" w:eastAsiaTheme="minorEastAsia" w:hAnsi="Cambria Math"/>
+            <w:lang w:val="en-US"/>
+          </w:rPr>
+          <m:t>u-v</m:t>
+        </m:r>
+      </m:oMath>
+      <w:r>
+        <w:rPr>
+          <w:rFonts w:eastAsiaTheme="minorEastAsia"/>
+          <w:lang w:val="en-US"/>
+        </w:rPr>
+        <w:t xml:space="preserve"> origin from 0 to </w:t>
+      </w:r>
+      <m:oMath>
+        <m:r>
+          <m:rPr>
+            <m:sty m:val="bi"/>
+          </m:rPr>
+          <w:rPr>
+            <w:rFonts w:ascii="Cambria Math" w:eastAsiaTheme="minorEastAsia" w:hAnsi="Cambria Math"/>
+            <w:lang w:val="en-US"/>
+          </w:rPr>
+          <m:t>v</m:t>
+        </m:r>
+      </m:oMath>
+      <w:r>
+        <w:rPr>
+          <w:rFonts w:eastAsiaTheme="minorEastAsia"/>
+          <w:lang w:val="en-US"/>
+        </w:rPr>
+        <w:t xml:space="preserve">. Algebraically, we can easily figure out that the difference of the vectors forms a triangle </w:t>
+      </w:r>
+      <m:oMath>
+        <m:r>
+          <m:rPr>
+            <m:sty m:val="bi"/>
+          </m:rPr>
+          <w:rPr>
+            <w:rFonts w:ascii="Cambria Math" w:eastAsiaTheme="minorEastAsia" w:hAnsi="Cambria Math"/>
+            <w:lang w:val="en-US"/>
+          </w:rPr>
+          <m:t>v+</m:t>
+        </m:r>
+        <m:d>
+          <m:dPr>
+            <m:ctrlPr>
+              <w:rPr>
+                <w:rFonts w:ascii="Cambria Math" w:eastAsiaTheme="minorEastAsia" w:hAnsi="Cambria Math"/>
+                <w:b/>
+                <w:bCs/>
+                <w:i/>
+                <w:lang w:val="en-US"/>
+              </w:rPr>
+            </m:ctrlPr>
+          </m:dPr>
+          <m:e>
+            <m:r>
+              <m:rPr>
+                <m:sty m:val="bi"/>
+              </m:rPr>
+              <w:rPr>
+                <w:rFonts w:ascii="Cambria Math" w:eastAsiaTheme="minorEastAsia" w:hAnsi="Cambria Math"/>
+                <w:lang w:val="en-US"/>
+              </w:rPr>
+              <m:t>u-v</m:t>
+            </m:r>
+          </m:e>
+        </m:d>
+        <m:r>
+          <w:rPr>
+            <w:rFonts w:ascii="Cambria Math" w:eastAsiaTheme="minorEastAsia" w:hAnsi="Cambria Math"/>
+            <w:lang w:val="en-US"/>
+          </w:rPr>
+          <m:t>=</m:t>
+        </m:r>
+        <m:r>
+          <m:rPr>
+            <m:sty m:val="bi"/>
+          </m:rPr>
+          <w:rPr>
+            <w:rFonts w:ascii="Cambria Math" w:eastAsiaTheme="minorEastAsia" w:hAnsi="Cambria Math"/>
+            <w:lang w:val="en-US"/>
+          </w:rPr>
+          <m:t>u</m:t>
+        </m:r>
+      </m:oMath>
+      <w:r>
+        <w:rPr>
+          <w:rFonts w:eastAsiaTheme="minorEastAsia"/>
+          <w:lang w:val="en-US"/>
+        </w:rPr>
+        <w:t>. Geometrically, it comes in handy to move the origin of</w:t>
+      </w:r>
+      <w:r>
+        <w:rPr>
+          <w:rFonts w:eastAsiaTheme="minorEastAsia"/>
+          <w:lang w:val="en-US"/>
+        </w:rPr>
+        <w:t xml:space="preserve"> the</w:t>
+      </w:r>
+      <w:r>
+        <w:rPr>
+          <w:rFonts w:eastAsiaTheme="minorEastAsia"/>
+          <w:lang w:val="en-US"/>
+        </w:rPr>
+        <w:t xml:space="preserve"> difference vector.</w:t>
+      </w:r>
+    </w:p>
+    <w:p>
+      <w:pPr>
+        <w:jc w:val="center"/>
+        <w:rPr>
+          <w:lang w:val="en-US"/>
+        </w:rPr>
+      </w:pPr>
+      <w:r>
+        <w:rPr>
+          <w:lang w:val="en-US"/>
+        </w:rPr>
+        <w:object w:dxaOrig="2967" w:dyaOrig="2397" w14:anchorId="3A15A775">
+          <v:shape id="_x0000_i1026" type="#_x0000_t75" style="width:232.9pt;height:189.1pt" o:ole="">
+            <v:imagedata r:id="rId8" o:title=""/>
+          </v:shape>
+          <o:OLEObject Type="Embed" ProgID="AxGlyph.Document" ShapeID="_x0000_i1026" DrawAspect="Content" ObjectID="_1830868619" r:id="rId9"/>
+        </w:object>
+      </w:r>
+    </w:p>
+    <w:p>
+      <w:pPr>
+        <w:jc w:val="both"/>
+        <w:rPr>
+          <w:lang w:val="en-US"/>
+        </w:rPr>
+      </w:pPr>
+      <w:r>
+        <w:rPr>
+          <w:lang w:val="en-US"/>
+        </w:rPr>
+        <w:tab/>
+        <w:t xml:space="preserve">The ultimate scope is to </w:t>
+      </w:r>
+      <w:r>
+        <w:rPr>
+          <w:lang w:val="en-US"/>
+        </w:rPr>
+        <w:t xml:space="preserve">be able to express the cosine of </w:t>
+      </w:r>
+      <m:oMath>
+        <m:r>
+          <w:rPr>
+            <w:rFonts w:ascii="Cambria Math" w:hAnsi="Cambria Math"/>
+            <w:lang w:val="en-US"/>
+          </w:rPr>
+          <m:t>α</m:t>
+        </m:r>
+      </m:oMath>
+      <w:r>
+        <w:rPr>
+          <w:rFonts w:eastAsiaTheme="minorEastAsia"/>
+          <w:lang w:val="en-US"/>
+        </w:rPr>
+        <w:t xml:space="preserve"> as a function of the initial information available, the vectors </w:t>
+      </w:r>
+      <m:oMath>
+        <m:r>
+          <m:rPr>
+            <m:sty m:val="bi"/>
+          </m:rPr>
+          <w:rPr>
+            <w:rFonts w:ascii="Cambria Math" w:eastAsiaTheme="minorEastAsia" w:hAnsi="Cambria Math"/>
+            <w:lang w:val="en-US"/>
+          </w:rPr>
+          <m:t>u</m:t>
+        </m:r>
+      </m:oMath>
+      <w:r>
+        <w:rPr>
+          <w:rFonts w:eastAsiaTheme="minorEastAsia"/>
+          <w:lang w:val="en-US"/>
+        </w:rPr>
+        <w:t xml:space="preserve"> and </w:t>
+      </w:r>
+      <m:oMath>
+        <m:r>
+          <m:rPr>
+            <m:sty m:val="bi"/>
+          </m:rPr>
+          <w:rPr>
+            <w:rFonts w:ascii="Cambria Math" w:eastAsiaTheme="minorEastAsia" w:hAnsi="Cambria Math"/>
+            <w:lang w:val="en-US"/>
+          </w:rPr>
+          <m:t>v</m:t>
+        </m:r>
+      </m:oMath>
+      <w:r>
+        <w:rPr>
+          <w:rFonts w:eastAsiaTheme="minorEastAsia"/>
+          <w:lang w:val="en-US"/>
+        </w:rPr>
+        <w:t>.</w:t>
+      </w:r>
+      <w:r>
+        <w:rPr>
+          <w:rFonts w:eastAsiaTheme="minorEastAsia"/>
+          <w:lang w:val="en-US"/>
+        </w:rPr>
+        <w:t xml:space="preserve"> By expressing the cosine of </w:t>
+      </w:r>
+      <m:oMath>
+        <m:r>
+          <w:rPr>
+            <w:rFonts w:ascii="Cambria Math" w:eastAsiaTheme="minorEastAsia" w:hAnsi="Cambria Math"/>
+            <w:lang w:val="en-US"/>
+          </w:rPr>
+          <m:t>α</m:t>
+        </m:r>
+      </m:oMath>
+      <w:r>
+        <w:rPr>
+          <w:rFonts w:eastAsiaTheme="minorEastAsia"/>
+          <w:lang w:val="en-US"/>
+        </w:rPr>
+        <w:t xml:space="preserve"> </w:t>
+      </w:r>
+      <w:r>
+        <w:rPr>
+          <w:rFonts w:eastAsiaTheme="minorEastAsia"/>
+          <w:lang w:val="en-US"/>
+        </w:rPr>
+        <w:t>as a function of our vectors, we can identify what is the link between the cosine and element-wise multiplication forms.</w:t>
+      </w:r>
+    </w:p>
+    <w:p>
+      <w:pPr>
+        <w:pStyle w:val="Heading3"/>
+        <w:rPr>
+          <w:rFonts w:eastAsiaTheme="minorEastAsia"/>
+          <w:lang w:val="en-US"/>
+        </w:rPr>
+      </w:pPr>
+      <w:r>
+        <w:rPr>
+          <w:rFonts w:eastAsiaTheme="minorEastAsia"/>
+          <w:lang w:val="en-US"/>
+        </w:rPr>
+        <w:t>The Law of Cosines</w:t>
+      </w:r>
+    </w:p>
+    <w:p>
+      <w:pPr>
+        <w:ind w:firstLine="708"/>
+        <w:jc w:val="both"/>
+        <w:rPr>
+          <w:lang w:val="en-US"/>
+        </w:rPr>
+      </w:pPr>
+      <w:r>
+        <w:rPr>
+          <w:lang w:val="en-US"/>
+        </w:rPr>
+        <w:t>Based on the figure above we can write the following expressions</w:t>
+      </w:r>
+      <w:r>
+        <w:rPr>
+          <w:lang w:val="en-US"/>
+        </w:rPr>
+        <w:t>:</w:t>
+      </w:r>
+    </w:p>
+    <w:p>
+      <w:pPr>
+        <w:ind w:firstLine="708"/>
+        <w:jc w:val="both"/>
+        <w:rPr>
+          <w:rFonts w:eastAsiaTheme="minorEastAsia"/>
+          <w:lang w:val="en-US"/>
+        </w:rPr>
+      </w:pPr>
+      <w:r>
+        <w:rPr>
           <w:lang w:val="en-US"/>
         </w:rPr>
         <w:t>From the definition</w:t>
@@ -801,6 +1398,12 @@
           <w:lang w:val="en-US"/>
         </w:rPr>
         <w:t>s</w:t>
+      </w:r>
+      <w:r>
+        <w:rPr>
+          <w:lang w:val="en-US"/>
+        </w:rPr>
+        <w:t xml:space="preserve"> of</w:t>
       </w:r>
       <w:r>
         <w:rPr>
@@ -1392,6 +1995,7 @@
     </w:p>
     <w:p>
       <w:pPr>
+        <w:jc w:val="both"/>
         <w:rPr>
           <w:rFonts w:eastAsiaTheme="minorEastAsia"/>
           <w:lang w:val="en-US"/>
@@ -1457,9 +2061,6 @@
             </m:e>
             <m:sup>
               <m:r>
-                <m:rPr>
-                  <m:sty m:val="bi"/>
-                </m:rPr>
                 <w:rPr>
                   <w:rFonts w:ascii="Cambria Math" w:eastAsiaTheme="minorEastAsia" w:hAnsi="Cambria Math"/>
                   <w:lang w:val="en-US"/>
@@ -1598,9 +2199,6 @@
             </m:e>
             <m:sup>
               <m:r>
-                <m:rPr>
-                  <m:sty m:val="bi"/>
-                </m:rPr>
                 <w:rPr>
                   <w:rFonts w:ascii="Cambria Math" w:eastAsiaTheme="minorEastAsia" w:hAnsi="Cambria Math"/>
                   <w:lang w:val="en-US"/>
@@ -1779,9 +2377,6 @@
             </m:e>
             <m:sup>
               <m:r>
-                <m:rPr>
-                  <m:sty m:val="bi"/>
-                </m:rPr>
                 <w:rPr>
                   <w:rFonts w:ascii="Cambria Math" w:eastAsiaTheme="minorEastAsia" w:hAnsi="Cambria Math"/>
                   <w:lang w:val="en-US"/>
@@ -2010,9 +2605,6 @@
             </m:e>
             <m:sup>
               <m:r>
-                <m:rPr>
-                  <m:sty m:val="bi"/>
-                </m:rPr>
                 <w:rPr>
                   <w:rFonts w:ascii="Cambria Math" w:eastAsiaTheme="minorEastAsia" w:hAnsi="Cambria Math"/>
                   <w:lang w:val="en-US"/>
@@ -2471,9 +3063,6 @@
             </m:e>
             <m:sup>
               <m:r>
-                <m:rPr>
-                  <m:sty m:val="bi"/>
-                </m:rPr>
                 <w:rPr>
                   <w:rFonts w:ascii="Cambria Math" w:eastAsiaTheme="minorEastAsia" w:hAnsi="Cambria Math"/>
                   <w:lang w:val="en-US"/>
@@ -3021,6 +3610,7 @@
           </w:tcPr>
           <w:p>
             <w:pPr>
+              <w:jc w:val="center"/>
               <w:rPr>
                 <w:rFonts w:eastAsiaTheme="minorEastAsia"/>
                 <w:iCs/>
@@ -3073,9 +3663,6 @@
                   </m:e>
                   <m:sup>
                     <m:r>
-                      <m:rPr>
-                        <m:sty m:val="bi"/>
-                      </m:rPr>
                       <w:rPr>
                         <w:rFonts w:ascii="Cambria Math" w:eastAsiaTheme="minorEastAsia" w:hAnsi="Cambria Math"/>
                         <w:lang w:val="en-US"/>
@@ -3381,18 +3968,27 @@
           <w:iCs/>
         </w:rPr>
       </w:pPr>
+      <w:proofErr w:type="spellStart"/>
       <w:r>
         <w:rPr>
           <w:rFonts w:eastAsiaTheme="minorEastAsia"/>
           <w:iCs/>
         </w:rPr>
-        <w:t xml:space="preserve">Equation </w:t>
-      </w:r>
+        <w:t>Equation</w:t>
+      </w:r>
+      <w:proofErr w:type="spellEnd"/>
       <w:r>
         <w:rPr>
           <w:rFonts w:eastAsiaTheme="minorEastAsia"/>
           <w:iCs/>
         </w:rPr>
+        <w:t xml:space="preserve"> </w:t>
+      </w:r>
+      <w:r>
+        <w:rPr>
+          <w:rFonts w:eastAsiaTheme="minorEastAsia"/>
+          <w:iCs/>
+        </w:rPr>
         <w:fldChar w:fldCharType="begin"/>
       </w:r>
       <w:r>
@@ -3439,15 +4035,33 @@
           <w:rFonts w:eastAsiaTheme="minorEastAsia"/>
           <w:iCs/>
         </w:rPr>
-        <w:t xml:space="preserve"> represents </w:t>
-      </w:r>
+        <w:t xml:space="preserve"> </w:t>
+      </w:r>
+      <w:proofErr w:type="spellStart"/>
       <w:r>
         <w:rPr>
           <w:rFonts w:eastAsiaTheme="minorEastAsia"/>
           <w:iCs/>
         </w:rPr>
+        <w:t>represents</w:t>
+      </w:r>
+      <w:proofErr w:type="spellEnd"/>
+      <w:r>
+        <w:rPr>
+          <w:rFonts w:eastAsiaTheme="minorEastAsia"/>
+          <w:iCs/>
+        </w:rPr>
+        <w:t xml:space="preserve"> </w:t>
+      </w:r>
+      <w:proofErr w:type="spellStart"/>
+      <w:r>
+        <w:rPr>
+          <w:rFonts w:eastAsiaTheme="minorEastAsia"/>
+          <w:iCs/>
+        </w:rPr>
         <w:t>the</w:t>
       </w:r>
+      <w:proofErr w:type="spellEnd"/>
       <w:r>
         <w:rPr>
           <w:rFonts w:eastAsiaTheme="minorEastAsia"/>
@@ -3455,19 +4069,382 @@
           <w:bCs/>
           <w:i/>
         </w:rPr>
-        <w:t xml:space="preserve"> Law of Cosines</w:t>
-      </w:r>
+        <w:t xml:space="preserve"> Law of </w:t>
+      </w:r>
+      <w:proofErr w:type="spellStart"/>
+      <w:r>
+        <w:rPr>
+          <w:rFonts w:eastAsiaTheme="minorEastAsia"/>
+          <w:b/>
+          <w:bCs/>
+          <w:i/>
+        </w:rPr>
+        <w:t>Cosines</w:t>
+      </w:r>
+      <w:proofErr w:type="spellEnd"/>
       <w:r>
         <w:rPr>
           <w:rFonts w:eastAsiaTheme="minorEastAsia"/>
           <w:iCs/>
         </w:rPr>
-        <w:t>, which allows us to determine the length of the third side of a triangle when the lengths of the other two sides and the included angle are known.</w:t>
+        <w:t xml:space="preserve">, </w:t>
+      </w:r>
+      <w:proofErr w:type="spellStart"/>
+      <w:r>
+        <w:rPr>
+          <w:rFonts w:eastAsiaTheme="minorEastAsia"/>
+          <w:iCs/>
+        </w:rPr>
+        <w:t>which</w:t>
+      </w:r>
+      <w:proofErr w:type="spellEnd"/>
+      <w:r>
+        <w:rPr>
+          <w:rFonts w:eastAsiaTheme="minorEastAsia"/>
+          <w:iCs/>
+        </w:rPr>
+        <w:t xml:space="preserve"> </w:t>
+      </w:r>
+      <w:proofErr w:type="spellStart"/>
+      <w:r>
+        <w:rPr>
+          <w:rFonts w:eastAsiaTheme="minorEastAsia"/>
+          <w:iCs/>
+        </w:rPr>
+        <w:t>allows</w:t>
+      </w:r>
+      <w:proofErr w:type="spellEnd"/>
+      <w:r>
+        <w:rPr>
+          <w:rFonts w:eastAsiaTheme="minorEastAsia"/>
+          <w:iCs/>
+        </w:rPr>
+        <w:t xml:space="preserve"> </w:t>
+      </w:r>
+      <w:proofErr w:type="spellStart"/>
+      <w:r>
+        <w:rPr>
+          <w:rFonts w:eastAsiaTheme="minorEastAsia"/>
+          <w:iCs/>
+        </w:rPr>
+        <w:t>us</w:t>
+      </w:r>
+      <w:proofErr w:type="spellEnd"/>
+      <w:r>
+        <w:rPr>
+          <w:rFonts w:eastAsiaTheme="minorEastAsia"/>
+          <w:iCs/>
+        </w:rPr>
+        <w:t xml:space="preserve"> </w:t>
+      </w:r>
+      <w:proofErr w:type="spellStart"/>
+      <w:r>
+        <w:rPr>
+          <w:rFonts w:eastAsiaTheme="minorEastAsia"/>
+          <w:iCs/>
+        </w:rPr>
+        <w:t>to</w:t>
+      </w:r>
+      <w:proofErr w:type="spellEnd"/>
+      <w:r>
+        <w:rPr>
+          <w:rFonts w:eastAsiaTheme="minorEastAsia"/>
+          <w:iCs/>
+        </w:rPr>
+        <w:t xml:space="preserve"> determine </w:t>
+      </w:r>
+      <w:proofErr w:type="spellStart"/>
+      <w:r>
+        <w:rPr>
+          <w:rFonts w:eastAsiaTheme="minorEastAsia"/>
+          <w:iCs/>
+        </w:rPr>
+        <w:t>the</w:t>
+      </w:r>
+      <w:proofErr w:type="spellEnd"/>
+      <w:r>
+        <w:rPr>
+          <w:rFonts w:eastAsiaTheme="minorEastAsia"/>
+          <w:iCs/>
+        </w:rPr>
+        <w:t xml:space="preserve"> </w:t>
+      </w:r>
+      <w:proofErr w:type="spellStart"/>
+      <w:r>
+        <w:rPr>
+          <w:rFonts w:eastAsiaTheme="minorEastAsia"/>
+          <w:iCs/>
+        </w:rPr>
+        <w:t>length</w:t>
+      </w:r>
+      <w:proofErr w:type="spellEnd"/>
+      <w:r>
+        <w:rPr>
+          <w:rFonts w:eastAsiaTheme="minorEastAsia"/>
+          <w:iCs/>
+        </w:rPr>
+        <w:t xml:space="preserve"> of </w:t>
+      </w:r>
+      <w:proofErr w:type="spellStart"/>
+      <w:r>
+        <w:rPr>
+          <w:rFonts w:eastAsiaTheme="minorEastAsia"/>
+          <w:iCs/>
+        </w:rPr>
+        <w:t>the</w:t>
+      </w:r>
+      <w:proofErr w:type="spellEnd"/>
+      <w:r>
+        <w:rPr>
+          <w:rFonts w:eastAsiaTheme="minorEastAsia"/>
+          <w:iCs/>
+        </w:rPr>
+        <w:t xml:space="preserve"> </w:t>
+      </w:r>
+      <w:proofErr w:type="spellStart"/>
+      <w:r>
+        <w:rPr>
+          <w:rFonts w:eastAsiaTheme="minorEastAsia"/>
+          <w:iCs/>
+        </w:rPr>
+        <w:t>third</w:t>
+      </w:r>
+      <w:proofErr w:type="spellEnd"/>
+      <w:r>
+        <w:rPr>
+          <w:rFonts w:eastAsiaTheme="minorEastAsia"/>
+          <w:iCs/>
+        </w:rPr>
+        <w:t xml:space="preserve"> </w:t>
+      </w:r>
+      <w:proofErr w:type="spellStart"/>
+      <w:r>
+        <w:rPr>
+          <w:rFonts w:eastAsiaTheme="minorEastAsia"/>
+          <w:iCs/>
+        </w:rPr>
+        <w:t>side</w:t>
+      </w:r>
+      <w:proofErr w:type="spellEnd"/>
+      <w:r>
+        <w:rPr>
+          <w:rFonts w:eastAsiaTheme="minorEastAsia"/>
+          <w:iCs/>
+        </w:rPr>
+        <w:t xml:space="preserve"> of a </w:t>
+      </w:r>
+      <w:proofErr w:type="spellStart"/>
+      <w:r>
+        <w:rPr>
+          <w:rFonts w:eastAsiaTheme="minorEastAsia"/>
+          <w:iCs/>
+        </w:rPr>
+        <w:t>triangle</w:t>
+      </w:r>
+      <w:proofErr w:type="spellEnd"/>
+      <w:r>
+        <w:rPr>
+          <w:rFonts w:eastAsiaTheme="minorEastAsia"/>
+          <w:iCs/>
+        </w:rPr>
+        <w:t xml:space="preserve"> </w:t>
+      </w:r>
+      <w:proofErr w:type="spellStart"/>
+      <w:r>
+        <w:rPr>
+          <w:rFonts w:eastAsiaTheme="minorEastAsia"/>
+          <w:iCs/>
+        </w:rPr>
+        <w:t>when</w:t>
+      </w:r>
+      <w:proofErr w:type="spellEnd"/>
+      <w:r>
+        <w:rPr>
+          <w:rFonts w:eastAsiaTheme="minorEastAsia"/>
+          <w:iCs/>
+        </w:rPr>
+        <w:t xml:space="preserve"> </w:t>
+      </w:r>
+      <w:proofErr w:type="spellStart"/>
+      <w:r>
+        <w:rPr>
+          <w:rFonts w:eastAsiaTheme="minorEastAsia"/>
+          <w:iCs/>
+        </w:rPr>
+        <w:t>the</w:t>
+      </w:r>
+      <w:proofErr w:type="spellEnd"/>
+      <w:r>
+        <w:rPr>
+          <w:rFonts w:eastAsiaTheme="minorEastAsia"/>
+          <w:iCs/>
+        </w:rPr>
+        <w:t xml:space="preserve"> </w:t>
+      </w:r>
+      <w:proofErr w:type="spellStart"/>
+      <w:r>
+        <w:rPr>
+          <w:rFonts w:eastAsiaTheme="minorEastAsia"/>
+          <w:iCs/>
+        </w:rPr>
+        <w:t>lengths</w:t>
+      </w:r>
+      <w:proofErr w:type="spellEnd"/>
+      <w:r>
+        <w:rPr>
+          <w:rFonts w:eastAsiaTheme="minorEastAsia"/>
+          <w:iCs/>
+        </w:rPr>
+        <w:t xml:space="preserve"> of </w:t>
+      </w:r>
+      <w:proofErr w:type="spellStart"/>
+      <w:r>
+        <w:rPr>
+          <w:rFonts w:eastAsiaTheme="minorEastAsia"/>
+          <w:iCs/>
+        </w:rPr>
+        <w:t>the</w:t>
+      </w:r>
+      <w:proofErr w:type="spellEnd"/>
+      <w:r>
+        <w:rPr>
+          <w:rFonts w:eastAsiaTheme="minorEastAsia"/>
+          <w:iCs/>
+        </w:rPr>
+        <w:t xml:space="preserve"> </w:t>
+      </w:r>
+      <w:proofErr w:type="spellStart"/>
+      <w:r>
+        <w:rPr>
+          <w:rFonts w:eastAsiaTheme="minorEastAsia"/>
+          <w:iCs/>
+        </w:rPr>
+        <w:t>other</w:t>
+      </w:r>
+      <w:proofErr w:type="spellEnd"/>
+      <w:r>
+        <w:rPr>
+          <w:rFonts w:eastAsiaTheme="minorEastAsia"/>
+          <w:iCs/>
+        </w:rPr>
+        <w:t xml:space="preserve"> </w:t>
+      </w:r>
+      <w:proofErr w:type="spellStart"/>
+      <w:r>
+        <w:rPr>
+          <w:rFonts w:eastAsiaTheme="minorEastAsia"/>
+          <w:iCs/>
+        </w:rPr>
+        <w:t>two</w:t>
+      </w:r>
+      <w:proofErr w:type="spellEnd"/>
+      <w:r>
+        <w:rPr>
+          <w:rFonts w:eastAsiaTheme="minorEastAsia"/>
+          <w:iCs/>
+        </w:rPr>
+        <w:t xml:space="preserve"> </w:t>
+      </w:r>
+      <w:proofErr w:type="spellStart"/>
+      <w:r>
+        <w:rPr>
+          <w:rFonts w:eastAsiaTheme="minorEastAsia"/>
+          <w:iCs/>
+        </w:rPr>
+        <w:t>sides</w:t>
+      </w:r>
+      <w:proofErr w:type="spellEnd"/>
+      <w:r>
+        <w:rPr>
+          <w:rFonts w:eastAsiaTheme="minorEastAsia"/>
+          <w:iCs/>
+        </w:rPr>
+        <w:t xml:space="preserve"> </w:t>
+      </w:r>
+      <w:proofErr w:type="spellStart"/>
+      <w:r>
+        <w:rPr>
+          <w:rFonts w:eastAsiaTheme="minorEastAsia"/>
+          <w:iCs/>
+        </w:rPr>
+        <w:t>and</w:t>
+      </w:r>
+      <w:proofErr w:type="spellEnd"/>
+      <w:r>
+        <w:rPr>
+          <w:rFonts w:eastAsiaTheme="minorEastAsia"/>
+          <w:iCs/>
+        </w:rPr>
+        <w:t xml:space="preserve"> </w:t>
+      </w:r>
+      <w:proofErr w:type="spellStart"/>
+      <w:r>
+        <w:rPr>
+          <w:rFonts w:eastAsiaTheme="minorEastAsia"/>
+          <w:iCs/>
+        </w:rPr>
+        <w:t>the</w:t>
+      </w:r>
+      <w:proofErr w:type="spellEnd"/>
+      <w:r>
+        <w:rPr>
+          <w:rFonts w:eastAsiaTheme="minorEastAsia"/>
+          <w:iCs/>
+        </w:rPr>
+        <w:t xml:space="preserve"> </w:t>
+      </w:r>
+      <w:proofErr w:type="spellStart"/>
+      <w:r>
+        <w:rPr>
+          <w:rFonts w:eastAsiaTheme="minorEastAsia"/>
+          <w:iCs/>
+        </w:rPr>
+        <w:t>included</w:t>
+      </w:r>
+      <w:proofErr w:type="spellEnd"/>
+      <w:r>
+        <w:rPr>
+          <w:rFonts w:eastAsiaTheme="minorEastAsia"/>
+          <w:iCs/>
+        </w:rPr>
+        <w:t xml:space="preserve"> </w:t>
+      </w:r>
+      <w:proofErr w:type="spellStart"/>
+      <w:r>
+        <w:rPr>
+          <w:rFonts w:eastAsiaTheme="minorEastAsia"/>
+          <w:iCs/>
+        </w:rPr>
+        <w:t>angle</w:t>
+      </w:r>
+      <w:proofErr w:type="spellEnd"/>
+      <w:r>
+        <w:rPr>
+          <w:rFonts w:eastAsiaTheme="minorEastAsia"/>
+          <w:iCs/>
+        </w:rPr>
+        <w:t xml:space="preserve"> are </w:t>
+      </w:r>
+      <w:proofErr w:type="spellStart"/>
+      <w:r>
+        <w:rPr>
+          <w:rFonts w:eastAsiaTheme="minorEastAsia"/>
+          <w:iCs/>
+        </w:rPr>
+        <w:t>known</w:t>
+      </w:r>
+      <w:proofErr w:type="spellEnd"/>
+      <w:r>
+        <w:rPr>
+          <w:rFonts w:eastAsiaTheme="minorEastAsia"/>
+          <w:iCs/>
+        </w:rPr>
+        <w:t>.</w:t>
       </w:r>
     </w:p>
     <w:p>
       <w:pPr>
-        <w:pStyle w:val="Heading2"/>
+        <w:pStyle w:val="Heading3"/>
         <w:rPr>
           <w:rFonts w:eastAsiaTheme="minorEastAsia"/>
           <w:lang w:val="en-US"/>
@@ -3985,7 +4962,143 @@
         <w:ind w:firstLine="576"/>
       </w:pPr>
       <w:r>
-        <w:t>The law of cosines provides us with an equation of this exact form of the dot product, so that we only need to demonstrate that:</w:t>
+        <w:t xml:space="preserve">The </w:t>
+      </w:r>
+      <w:proofErr w:type="spellStart"/>
+      <w:r>
+        <w:t>law</w:t>
+      </w:r>
+      <w:proofErr w:type="spellEnd"/>
+      <w:r>
+        <w:t xml:space="preserve"> of </w:t>
+      </w:r>
+      <w:proofErr w:type="spellStart"/>
+      <w:r>
+        <w:t>cosines</w:t>
+      </w:r>
+      <w:proofErr w:type="spellEnd"/>
+      <w:r>
+        <w:t xml:space="preserve"> </w:t>
+      </w:r>
+      <w:proofErr w:type="spellStart"/>
+      <w:r>
+        <w:t>provides</w:t>
+      </w:r>
+      <w:proofErr w:type="spellEnd"/>
+      <w:r>
+        <w:t xml:space="preserve"> </w:t>
+      </w:r>
+      <w:proofErr w:type="spellStart"/>
+      <w:r>
+        <w:t>us</w:t>
+      </w:r>
+      <w:proofErr w:type="spellEnd"/>
+      <w:r>
+        <w:t xml:space="preserve"> </w:t>
+      </w:r>
+      <w:proofErr w:type="spellStart"/>
+      <w:r>
+        <w:t>with</w:t>
+      </w:r>
+      <w:proofErr w:type="spellEnd"/>
+      <w:r>
+        <w:t xml:space="preserve"> an </w:t>
+      </w:r>
+      <w:proofErr w:type="spellStart"/>
+      <w:r>
+        <w:t>equation</w:t>
+      </w:r>
+      <w:proofErr w:type="spellEnd"/>
+      <w:r>
+        <w:t xml:space="preserve"> of </w:t>
+      </w:r>
+      <w:proofErr w:type="spellStart"/>
+      <w:r>
+        <w:t>this</w:t>
+      </w:r>
+      <w:proofErr w:type="spellEnd"/>
+      <w:r>
+        <w:t xml:space="preserve"> exact </w:t>
+      </w:r>
+      <w:proofErr w:type="spellStart"/>
+      <w:r>
+        <w:t>form</w:t>
+      </w:r>
+      <w:proofErr w:type="spellEnd"/>
+      <w:r>
+        <w:t xml:space="preserve"> of </w:t>
+      </w:r>
+      <w:proofErr w:type="spellStart"/>
+      <w:r>
+        <w:t>the</w:t>
+      </w:r>
+      <w:proofErr w:type="spellEnd"/>
+      <w:r>
+        <w:t xml:space="preserve"> </w:t>
+      </w:r>
+      <w:proofErr w:type="spellStart"/>
+      <w:r>
+        <w:t>dot</w:t>
+      </w:r>
+      <w:proofErr w:type="spellEnd"/>
+      <w:r>
+        <w:t xml:space="preserve"> product, </w:t>
+      </w:r>
+      <w:proofErr w:type="spellStart"/>
+      <w:r>
+        <w:t>so</w:t>
+      </w:r>
+      <w:proofErr w:type="spellEnd"/>
+      <w:r>
+        <w:t xml:space="preserve"> </w:t>
+      </w:r>
+      <w:proofErr w:type="spellStart"/>
+      <w:r>
+        <w:t>that</w:t>
+      </w:r>
+      <w:proofErr w:type="spellEnd"/>
+      <w:r>
+        <w:t xml:space="preserve"> </w:t>
+      </w:r>
+      <w:proofErr w:type="spellStart"/>
+      <w:r>
+        <w:t>we</w:t>
+      </w:r>
+      <w:proofErr w:type="spellEnd"/>
+      <w:r>
+        <w:t xml:space="preserve"> </w:t>
+      </w:r>
+      <w:proofErr w:type="spellStart"/>
+      <w:r>
+        <w:t>only</w:t>
+      </w:r>
+      <w:proofErr w:type="spellEnd"/>
+      <w:r>
+        <w:t xml:space="preserve"> </w:t>
+      </w:r>
+      <w:proofErr w:type="spellStart"/>
+      <w:r>
+        <w:t>need</w:t>
+      </w:r>
+      <w:proofErr w:type="spellEnd"/>
+      <w:r>
+        <w:t xml:space="preserve"> </w:t>
+      </w:r>
+      <w:proofErr w:type="spellStart"/>
+      <w:r>
+        <w:t>to</w:t>
+      </w:r>
+      <w:proofErr w:type="spellEnd"/>
+      <w:r>
+        <w:t xml:space="preserve"> demonstrate </w:t>
+      </w:r>
+      <w:proofErr w:type="spellStart"/>
+      <w:r>
+        <w:t>that</w:t>
+      </w:r>
+      <w:proofErr w:type="spellEnd"/>
+      <w:r>
+        <w:t>:</w:t>
       </w:r>
     </w:p>
     <w:p>
@@ -4930,7 +6043,6 @@
               <w:rFonts w:ascii="Cambria Math" w:eastAsiaTheme="minorEastAsia" w:hAnsi="Cambria Math"/>
               <w:lang w:val="en-US"/>
             </w:rPr>
-            <w:lastRenderedPageBreak/>
             <m:t>2</m:t>
           </m:r>
           <m:d>
@@ -5381,6 +6493,7 @@
               <w:rFonts w:ascii="Cambria Math" w:eastAsiaTheme="minorEastAsia" w:hAnsi="Cambria Math"/>
               <w:lang w:val="en-US"/>
             </w:rPr>
+            <w:lastRenderedPageBreak/>
             <m:t>2</m:t>
           </m:r>
           <m:d>
@@ -5813,7 +6926,1912 @@
     </w:p>
     <w:p>
       <w:pPr>
-        <w:pStyle w:val="Heading1"/>
+        <w:pStyle w:val="Heading2"/>
+        <w:rPr>
+          <w:rFonts w:eastAsiaTheme="minorEastAsia"/>
+          <w:lang w:val="en-US"/>
+        </w:rPr>
+      </w:pPr>
+      <w:r>
+        <w:rPr>
+          <w:rFonts w:eastAsiaTheme="minorEastAsia"/>
+          <w:lang w:val="en-US"/>
+        </w:rPr>
+        <w:t>Pythagorean Theorem on n dimensions</w:t>
+      </w:r>
+    </w:p>
+    <w:p>
+      <w:pPr>
+        <w:ind w:firstLine="708"/>
+        <w:rPr>
+          <w:rFonts w:eastAsiaTheme="minorEastAsia"/>
+          <w:lang w:val="en-US"/>
+        </w:rPr>
+      </w:pPr>
+      <w:r>
+        <w:rPr>
+          <w:lang w:val="en-US"/>
+        </w:rPr>
+        <w:t xml:space="preserve">Let’s consider the vector </w:t>
+      </w:r>
+      <m:oMath>
+        <m:r>
+          <m:rPr>
+            <m:sty m:val="bi"/>
+          </m:rPr>
+          <w:rPr>
+            <w:rFonts w:ascii="Cambria Math" w:hAnsi="Cambria Math"/>
+            <w:lang w:val="en-US"/>
+          </w:rPr>
+          <m:t>u</m:t>
+        </m:r>
+        <m:r>
+          <w:rPr>
+            <w:rFonts w:ascii="Cambria Math" w:eastAsiaTheme="minorEastAsia" w:hAnsi="Cambria Math"/>
+            <w:lang w:val="en-US"/>
+          </w:rPr>
+          <m:t xml:space="preserve">∈ </m:t>
+        </m:r>
+        <m:sSup>
+          <m:sSupPr>
+            <m:ctrlPr>
+              <w:rPr>
+                <w:rFonts w:ascii="Cambria Math" w:eastAsiaTheme="minorEastAsia" w:hAnsi="Cambria Math"/>
+                <w:i/>
+                <w:lang w:val="en-US"/>
+              </w:rPr>
+            </m:ctrlPr>
+          </m:sSupPr>
+          <m:e>
+            <m:r>
+              <m:rPr>
+                <m:scr m:val="double-struck"/>
+              </m:rPr>
+              <w:rPr>
+                <w:rFonts w:ascii="Cambria Math" w:eastAsiaTheme="minorEastAsia" w:hAnsi="Cambria Math"/>
+                <w:lang w:val="en-US"/>
+              </w:rPr>
+              <m:t>R</m:t>
+            </m:r>
+          </m:e>
+          <m:sup>
+            <m:r>
+              <w:rPr>
+                <w:rFonts w:ascii="Cambria Math" w:eastAsiaTheme="minorEastAsia" w:hAnsi="Cambria Math"/>
+                <w:lang w:val="en-US"/>
+              </w:rPr>
+              <m:t>3</m:t>
+            </m:r>
+          </m:sup>
+        </m:sSup>
+      </m:oMath>
+      <w:r>
+        <w:rPr>
+          <w:rFonts w:eastAsiaTheme="minorEastAsia"/>
+          <w:lang w:val="en-US"/>
+        </w:rPr>
+        <w:t xml:space="preserve">. All the </w:t>
+      </w:r>
+      <w:r>
+        <w:rPr>
+          <w:rFonts w:eastAsiaTheme="minorEastAsia"/>
+          <w:lang w:val="en-US"/>
+        </w:rPr>
+        <w:t>3</w:t>
+      </w:r>
+      <w:r>
+        <w:rPr>
+          <w:rFonts w:eastAsiaTheme="minorEastAsia"/>
+          <w:lang w:val="en-US"/>
+        </w:rPr>
+        <w:t xml:space="preserve"> vectors are perpendicular to each other. In this case we see that:</w:t>
+      </w:r>
+    </w:p>
+    <w:p>
+      <w:pPr>
+        <w:ind w:firstLine="708"/>
+        <w:rPr>
+          <w:rFonts w:eastAsiaTheme="minorEastAsia"/>
+          <w:lang w:val="en-US"/>
+        </w:rPr>
+      </w:pPr>
+      <m:oMathPara>
+        <m:oMath>
+          <m:sSub>
+            <m:sSubPr>
+              <m:ctrlPr>
+                <w:rPr>
+                  <w:rFonts w:ascii="Cambria Math" w:hAnsi="Cambria Math"/>
+                  <w:i/>
+                  <w:lang w:val="en-US"/>
+                </w:rPr>
+              </m:ctrlPr>
+            </m:sSubPr>
+            <m:e>
+              <m:r>
+                <w:rPr>
+                  <w:rFonts w:ascii="Cambria Math" w:hAnsi="Cambria Math"/>
+                  <w:lang w:val="en-US"/>
+                </w:rPr>
+                <m:t>l</m:t>
+              </m:r>
+            </m:e>
+            <m:sub>
+              <m:r>
+                <w:rPr>
+                  <w:rFonts w:ascii="Cambria Math" w:hAnsi="Cambria Math"/>
+                  <w:lang w:val="en-US"/>
+                </w:rPr>
+                <m:t>1</m:t>
+              </m:r>
+            </m:sub>
+          </m:sSub>
+          <m:r>
+            <w:rPr>
+              <w:rFonts w:ascii="Cambria Math" w:hAnsi="Cambria Math"/>
+              <w:lang w:val="en-US"/>
+            </w:rPr>
+            <m:t>=</m:t>
+          </m:r>
+          <m:rad>
+            <m:radPr>
+              <m:degHide m:val="1"/>
+              <m:ctrlPr>
+                <w:rPr>
+                  <w:rFonts w:ascii="Cambria Math" w:hAnsi="Cambria Math"/>
+                  <w:i/>
+                  <w:lang w:val="en-US"/>
+                </w:rPr>
+              </m:ctrlPr>
+            </m:radPr>
+            <m:deg/>
+            <m:e>
+              <m:sSubSup>
+                <m:sSubSupPr>
+                  <m:ctrlPr>
+                    <w:rPr>
+                      <w:rFonts w:ascii="Cambria Math" w:hAnsi="Cambria Math"/>
+                      <w:i/>
+                      <w:lang w:val="en-US"/>
+                    </w:rPr>
+                  </m:ctrlPr>
+                </m:sSubSupPr>
+                <m:e>
+                  <m:r>
+                    <w:rPr>
+                      <w:rFonts w:ascii="Cambria Math" w:hAnsi="Cambria Math"/>
+                      <w:lang w:val="en-US"/>
+                    </w:rPr>
+                    <m:t>u</m:t>
+                  </m:r>
+                </m:e>
+                <m:sub>
+                  <m:r>
+                    <w:rPr>
+                      <w:rFonts w:ascii="Cambria Math" w:hAnsi="Cambria Math"/>
+                      <w:lang w:val="en-US"/>
+                    </w:rPr>
+                    <m:t>1</m:t>
+                  </m:r>
+                </m:sub>
+                <m:sup>
+                  <m:r>
+                    <w:rPr>
+                      <w:rFonts w:ascii="Cambria Math" w:hAnsi="Cambria Math"/>
+                      <w:lang w:val="en-US"/>
+                    </w:rPr>
+                    <m:t>2</m:t>
+                  </m:r>
+                </m:sup>
+              </m:sSubSup>
+              <m:r>
+                <w:rPr>
+                  <w:rFonts w:ascii="Cambria Math" w:hAnsi="Cambria Math"/>
+                  <w:lang w:val="en-US"/>
+                </w:rPr>
+                <m:t>+</m:t>
+              </m:r>
+              <m:sSubSup>
+                <m:sSubSupPr>
+                  <m:ctrlPr>
+                    <w:rPr>
+                      <w:rFonts w:ascii="Cambria Math" w:hAnsi="Cambria Math"/>
+                      <w:i/>
+                      <w:lang w:val="en-US"/>
+                    </w:rPr>
+                  </m:ctrlPr>
+                </m:sSubSupPr>
+                <m:e>
+                  <m:r>
+                    <w:rPr>
+                      <w:rFonts w:ascii="Cambria Math" w:hAnsi="Cambria Math"/>
+                      <w:lang w:val="en-US"/>
+                    </w:rPr>
+                    <m:t>u</m:t>
+                  </m:r>
+                </m:e>
+                <m:sub>
+                  <m:r>
+                    <w:rPr>
+                      <w:rFonts w:ascii="Cambria Math" w:hAnsi="Cambria Math"/>
+                      <w:lang w:val="en-US"/>
+                    </w:rPr>
+                    <m:t>2</m:t>
+                  </m:r>
+                </m:sub>
+                <m:sup>
+                  <m:r>
+                    <w:rPr>
+                      <w:rFonts w:ascii="Cambria Math" w:hAnsi="Cambria Math"/>
+                      <w:lang w:val="en-US"/>
+                    </w:rPr>
+                    <m:t>2</m:t>
+                  </m:r>
+                </m:sup>
+              </m:sSubSup>
+            </m:e>
+          </m:rad>
+        </m:oMath>
+      </m:oMathPara>
+    </w:p>
+    <w:p>
+      <w:pPr>
+        <w:ind w:firstLine="708"/>
+        <w:jc w:val="center"/>
+        <w:rPr>
+          <w:rFonts w:eastAsiaTheme="minorEastAsia"/>
+          <w:lang w:val="en-US"/>
+        </w:rPr>
+      </w:pPr>
+      <w:r>
+        <w:rPr>
+          <w:rFonts w:eastAsiaTheme="minorEastAsia"/>
+          <w:lang w:val="en-US"/>
+        </w:rPr>
+        <w:object w:dxaOrig="3885" w:dyaOrig="4069" w14:anchorId="427A9C27">
+          <v:shape id="_x0000_i1027" type="#_x0000_t75" style="width:259.85pt;height:272.35pt" o:ole="">
+            <v:imagedata r:id="rId10" o:title=""/>
+          </v:shape>
+          <o:OLEObject Type="Embed" ProgID="AxGlyph.Document" ShapeID="_x0000_i1027" DrawAspect="Content" ObjectID="_1830868620" r:id="rId11"/>
+        </w:object>
+      </w:r>
+    </w:p>
+    <w:p>
+      <w:pPr>
+        <w:ind w:firstLine="708"/>
+        <w:rPr>
+          <w:rFonts w:eastAsiaTheme="minorEastAsia"/>
+          <w:lang w:val="en-US"/>
+        </w:rPr>
+      </w:pPr>
+      <w:r>
+        <w:rPr>
+          <w:rFonts w:eastAsiaTheme="minorEastAsia"/>
+          <w:lang w:val="en-US"/>
+        </w:rPr>
+        <w:t xml:space="preserve">The vector </w:t>
+      </w:r>
+      <m:oMath>
+        <m:r>
+          <w:rPr>
+            <w:rFonts w:ascii="Cambria Math" w:eastAsiaTheme="minorEastAsia" w:hAnsi="Cambria Math"/>
+            <w:lang w:val="en-US"/>
+          </w:rPr>
+          <m:t>(</m:t>
+        </m:r>
+        <m:sSub>
+          <m:sSubPr>
+            <m:ctrlPr>
+              <w:rPr>
+                <w:rFonts w:ascii="Cambria Math" w:eastAsiaTheme="minorEastAsia" w:hAnsi="Cambria Math"/>
+                <w:i/>
+                <w:lang w:val="en-US"/>
+              </w:rPr>
+            </m:ctrlPr>
+          </m:sSubPr>
+          <m:e>
+            <m:r>
+              <w:rPr>
+                <w:rFonts w:ascii="Cambria Math" w:eastAsiaTheme="minorEastAsia" w:hAnsi="Cambria Math"/>
+                <w:lang w:val="en-US"/>
+              </w:rPr>
+              <m:t>u</m:t>
+            </m:r>
+          </m:e>
+          <m:sub>
+            <m:r>
+              <w:rPr>
+                <w:rFonts w:ascii="Cambria Math" w:eastAsiaTheme="minorEastAsia" w:hAnsi="Cambria Math"/>
+                <w:lang w:val="en-US"/>
+              </w:rPr>
+              <m:t>1</m:t>
+            </m:r>
+          </m:sub>
+        </m:sSub>
+        <m:r>
+          <w:rPr>
+            <w:rFonts w:ascii="Cambria Math" w:eastAsiaTheme="minorEastAsia" w:hAnsi="Cambria Math"/>
+            <w:lang w:val="en-US"/>
+          </w:rPr>
+          <m:t xml:space="preserve">, </m:t>
+        </m:r>
+        <m:sSub>
+          <m:sSubPr>
+            <m:ctrlPr>
+              <w:rPr>
+                <w:rFonts w:ascii="Cambria Math" w:eastAsiaTheme="minorEastAsia" w:hAnsi="Cambria Math"/>
+                <w:i/>
+                <w:lang w:val="en-US"/>
+              </w:rPr>
+            </m:ctrlPr>
+          </m:sSubPr>
+          <m:e>
+            <m:r>
+              <w:rPr>
+                <w:rFonts w:ascii="Cambria Math" w:eastAsiaTheme="minorEastAsia" w:hAnsi="Cambria Math"/>
+                <w:lang w:val="en-US"/>
+              </w:rPr>
+              <m:t>u</m:t>
+            </m:r>
+          </m:e>
+          <m:sub>
+            <m:r>
+              <w:rPr>
+                <w:rFonts w:ascii="Cambria Math" w:eastAsiaTheme="minorEastAsia" w:hAnsi="Cambria Math"/>
+                <w:lang w:val="en-US"/>
+              </w:rPr>
+              <m:t>2</m:t>
+            </m:r>
+          </m:sub>
+        </m:sSub>
+        <m:r>
+          <w:rPr>
+            <w:rFonts w:ascii="Cambria Math" w:eastAsiaTheme="minorEastAsia" w:hAnsi="Cambria Math"/>
+            <w:lang w:val="en-US"/>
+          </w:rPr>
+          <m:t>,0)</m:t>
+        </m:r>
+      </m:oMath>
+      <w:r>
+        <w:rPr>
+          <w:rFonts w:eastAsiaTheme="minorEastAsia"/>
+          <w:lang w:val="en-US"/>
+        </w:rPr>
+        <w:t xml:space="preserve"> is perpendicular to the vector </w:t>
+      </w:r>
+      <m:oMath>
+        <m:r>
+          <w:rPr>
+            <w:rFonts w:ascii="Cambria Math" w:eastAsiaTheme="minorEastAsia" w:hAnsi="Cambria Math"/>
+            <w:lang w:val="en-US"/>
+          </w:rPr>
+          <m:t>(0,0,</m:t>
+        </m:r>
+        <m:sSub>
+          <m:sSubPr>
+            <m:ctrlPr>
+              <w:rPr>
+                <w:rFonts w:ascii="Cambria Math" w:eastAsiaTheme="minorEastAsia" w:hAnsi="Cambria Math"/>
+                <w:i/>
+                <w:lang w:val="en-US"/>
+              </w:rPr>
+            </m:ctrlPr>
+          </m:sSubPr>
+          <m:e>
+            <m:r>
+              <w:rPr>
+                <w:rFonts w:ascii="Cambria Math" w:eastAsiaTheme="minorEastAsia" w:hAnsi="Cambria Math"/>
+                <w:lang w:val="en-US"/>
+              </w:rPr>
+              <m:t>u</m:t>
+            </m:r>
+          </m:e>
+          <m:sub>
+            <m:r>
+              <w:rPr>
+                <w:rFonts w:ascii="Cambria Math" w:eastAsiaTheme="minorEastAsia" w:hAnsi="Cambria Math"/>
+                <w:lang w:val="en-US"/>
+              </w:rPr>
+              <m:t>3</m:t>
+            </m:r>
+          </m:sub>
+        </m:sSub>
+        <m:r>
+          <w:rPr>
+            <w:rFonts w:ascii="Cambria Math" w:eastAsiaTheme="minorEastAsia" w:hAnsi="Cambria Math"/>
+            <w:lang w:val="en-US"/>
+          </w:rPr>
+          <m:t>)</m:t>
+        </m:r>
+      </m:oMath>
+      <w:r>
+        <w:rPr>
+          <w:rFonts w:eastAsiaTheme="minorEastAsia"/>
+          <w:lang w:val="en-US"/>
+        </w:rPr>
+        <w:t xml:space="preserve">, then the length of the vector </w:t>
+      </w:r>
+      <m:oMath>
+        <m:r>
+          <w:rPr>
+            <w:rFonts w:ascii="Cambria Math" w:eastAsiaTheme="minorEastAsia" w:hAnsi="Cambria Math"/>
+            <w:lang w:val="en-US"/>
+          </w:rPr>
+          <m:t>(</m:t>
+        </m:r>
+        <m:sSub>
+          <m:sSubPr>
+            <m:ctrlPr>
+              <w:rPr>
+                <w:rFonts w:ascii="Cambria Math" w:eastAsiaTheme="minorEastAsia" w:hAnsi="Cambria Math"/>
+                <w:i/>
+                <w:lang w:val="en-US"/>
+              </w:rPr>
+            </m:ctrlPr>
+          </m:sSubPr>
+          <m:e>
+            <m:r>
+              <w:rPr>
+                <w:rFonts w:ascii="Cambria Math" w:eastAsiaTheme="minorEastAsia" w:hAnsi="Cambria Math"/>
+                <w:lang w:val="en-US"/>
+              </w:rPr>
+              <m:t>u</m:t>
+            </m:r>
+          </m:e>
+          <m:sub>
+            <m:r>
+              <w:rPr>
+                <w:rFonts w:ascii="Cambria Math" w:eastAsiaTheme="minorEastAsia" w:hAnsi="Cambria Math"/>
+                <w:lang w:val="en-US"/>
+              </w:rPr>
+              <m:t>1</m:t>
+            </m:r>
+          </m:sub>
+        </m:sSub>
+        <m:r>
+          <w:rPr>
+            <w:rFonts w:ascii="Cambria Math" w:eastAsiaTheme="minorEastAsia" w:hAnsi="Cambria Math"/>
+            <w:lang w:val="en-US"/>
+          </w:rPr>
+          <m:t>,</m:t>
+        </m:r>
+        <m:sSub>
+          <m:sSubPr>
+            <m:ctrlPr>
+              <w:rPr>
+                <w:rFonts w:ascii="Cambria Math" w:eastAsiaTheme="minorEastAsia" w:hAnsi="Cambria Math"/>
+                <w:i/>
+                <w:lang w:val="en-US"/>
+              </w:rPr>
+            </m:ctrlPr>
+          </m:sSubPr>
+          <m:e>
+            <m:r>
+              <w:rPr>
+                <w:rFonts w:ascii="Cambria Math" w:eastAsiaTheme="minorEastAsia" w:hAnsi="Cambria Math"/>
+                <w:lang w:val="en-US"/>
+              </w:rPr>
+              <m:t>u</m:t>
+            </m:r>
+          </m:e>
+          <m:sub>
+            <m:r>
+              <w:rPr>
+                <w:rFonts w:ascii="Cambria Math" w:eastAsiaTheme="minorEastAsia" w:hAnsi="Cambria Math"/>
+                <w:lang w:val="en-US"/>
+              </w:rPr>
+              <m:t>2</m:t>
+            </m:r>
+          </m:sub>
+        </m:sSub>
+        <m:r>
+          <w:rPr>
+            <w:rFonts w:ascii="Cambria Math" w:eastAsiaTheme="minorEastAsia" w:hAnsi="Cambria Math"/>
+            <w:lang w:val="en-US"/>
+          </w:rPr>
+          <m:t>,</m:t>
+        </m:r>
+        <m:sSub>
+          <m:sSubPr>
+            <m:ctrlPr>
+              <w:rPr>
+                <w:rFonts w:ascii="Cambria Math" w:eastAsiaTheme="minorEastAsia" w:hAnsi="Cambria Math"/>
+                <w:i/>
+                <w:lang w:val="en-US"/>
+              </w:rPr>
+            </m:ctrlPr>
+          </m:sSubPr>
+          <m:e>
+            <m:r>
+              <w:rPr>
+                <w:rFonts w:ascii="Cambria Math" w:eastAsiaTheme="minorEastAsia" w:hAnsi="Cambria Math"/>
+                <w:lang w:val="en-US"/>
+              </w:rPr>
+              <m:t>u</m:t>
+            </m:r>
+          </m:e>
+          <m:sub>
+            <m:r>
+              <w:rPr>
+                <w:rFonts w:ascii="Cambria Math" w:eastAsiaTheme="minorEastAsia" w:hAnsi="Cambria Math"/>
+                <w:lang w:val="en-US"/>
+              </w:rPr>
+              <m:t>3</m:t>
+            </m:r>
+          </m:sub>
+        </m:sSub>
+        <m:r>
+          <w:rPr>
+            <w:rFonts w:ascii="Cambria Math" w:eastAsiaTheme="minorEastAsia" w:hAnsi="Cambria Math"/>
+            <w:lang w:val="en-US"/>
+          </w:rPr>
+          <m:t>)</m:t>
+        </m:r>
+      </m:oMath>
+      <w:r>
+        <w:rPr>
+          <w:rFonts w:eastAsiaTheme="minorEastAsia"/>
+          <w:lang w:val="en-US"/>
+        </w:rPr>
+        <w:t xml:space="preserve"> is:</w:t>
+      </w:r>
+    </w:p>
+    <w:p>
+      <w:pPr>
+        <w:ind w:firstLine="708"/>
+        <w:rPr>
+          <w:rFonts w:eastAsiaTheme="minorEastAsia"/>
+          <w:lang w:val="en-US"/>
+        </w:rPr>
+      </w:pPr>
+      <m:oMathPara>
+        <m:oMath>
+          <m:sSub>
+            <m:sSubPr>
+              <m:ctrlPr>
+                <w:rPr>
+                  <w:rFonts w:ascii="Cambria Math" w:hAnsi="Cambria Math"/>
+                  <w:i/>
+                  <w:lang w:val="en-US"/>
+                </w:rPr>
+              </m:ctrlPr>
+            </m:sSubPr>
+            <m:e>
+              <m:r>
+                <w:rPr>
+                  <w:rFonts w:ascii="Cambria Math" w:hAnsi="Cambria Math"/>
+                  <w:lang w:val="en-US"/>
+                </w:rPr>
+                <m:t>l</m:t>
+              </m:r>
+            </m:e>
+            <m:sub>
+              <m:r>
+                <w:rPr>
+                  <w:rFonts w:ascii="Cambria Math" w:hAnsi="Cambria Math"/>
+                  <w:lang w:val="en-US"/>
+                </w:rPr>
+                <m:t>2</m:t>
+              </m:r>
+            </m:sub>
+          </m:sSub>
+          <m:r>
+            <w:rPr>
+              <w:rFonts w:ascii="Cambria Math" w:hAnsi="Cambria Math"/>
+              <w:lang w:val="en-US"/>
+            </w:rPr>
+            <m:t>=</m:t>
+          </m:r>
+          <m:rad>
+            <m:radPr>
+              <m:degHide m:val="1"/>
+              <m:ctrlPr>
+                <w:rPr>
+                  <w:rFonts w:ascii="Cambria Math" w:hAnsi="Cambria Math"/>
+                  <w:i/>
+                  <w:lang w:val="en-US"/>
+                </w:rPr>
+              </m:ctrlPr>
+            </m:radPr>
+            <m:deg/>
+            <m:e>
+              <m:sSubSup>
+                <m:sSubSupPr>
+                  <m:ctrlPr>
+                    <w:rPr>
+                      <w:rFonts w:ascii="Cambria Math" w:hAnsi="Cambria Math"/>
+                      <w:i/>
+                      <w:lang w:val="en-US"/>
+                    </w:rPr>
+                  </m:ctrlPr>
+                </m:sSubSupPr>
+                <m:e>
+                  <m:r>
+                    <w:rPr>
+                      <w:rFonts w:ascii="Cambria Math" w:hAnsi="Cambria Math"/>
+                      <w:lang w:val="en-US"/>
+                    </w:rPr>
+                    <m:t>l</m:t>
+                  </m:r>
+                </m:e>
+                <m:sub>
+                  <m:r>
+                    <w:rPr>
+                      <w:rFonts w:ascii="Cambria Math" w:hAnsi="Cambria Math"/>
+                      <w:lang w:val="en-US"/>
+                    </w:rPr>
+                    <m:t>1</m:t>
+                  </m:r>
+                </m:sub>
+                <m:sup>
+                  <m:r>
+                    <w:rPr>
+                      <w:rFonts w:ascii="Cambria Math" w:hAnsi="Cambria Math"/>
+                      <w:lang w:val="en-US"/>
+                    </w:rPr>
+                    <m:t>2</m:t>
+                  </m:r>
+                </m:sup>
+              </m:sSubSup>
+              <m:r>
+                <w:rPr>
+                  <w:rFonts w:ascii="Cambria Math" w:hAnsi="Cambria Math"/>
+                  <w:lang w:val="en-US"/>
+                </w:rPr>
+                <m:t>+</m:t>
+              </m:r>
+              <m:sSubSup>
+                <m:sSubSupPr>
+                  <m:ctrlPr>
+                    <w:rPr>
+                      <w:rFonts w:ascii="Cambria Math" w:hAnsi="Cambria Math"/>
+                      <w:i/>
+                      <w:lang w:val="en-US"/>
+                    </w:rPr>
+                  </m:ctrlPr>
+                </m:sSubSupPr>
+                <m:e>
+                  <m:r>
+                    <w:rPr>
+                      <w:rFonts w:ascii="Cambria Math" w:hAnsi="Cambria Math"/>
+                      <w:lang w:val="en-US"/>
+                    </w:rPr>
+                    <m:t>u</m:t>
+                  </m:r>
+                </m:e>
+                <m:sub>
+                  <m:r>
+                    <w:rPr>
+                      <w:rFonts w:ascii="Cambria Math" w:hAnsi="Cambria Math"/>
+                      <w:lang w:val="en-US"/>
+                    </w:rPr>
+                    <m:t>3</m:t>
+                  </m:r>
+                </m:sub>
+                <m:sup>
+                  <m:r>
+                    <w:rPr>
+                      <w:rFonts w:ascii="Cambria Math" w:hAnsi="Cambria Math"/>
+                      <w:lang w:val="en-US"/>
+                    </w:rPr>
+                    <m:t>2</m:t>
+                  </m:r>
+                </m:sup>
+              </m:sSubSup>
+            </m:e>
+          </m:rad>
+        </m:oMath>
+      </m:oMathPara>
+    </w:p>
+    <w:p>
+      <w:pPr>
+        <w:ind w:firstLine="708"/>
+        <w:rPr>
+          <w:rFonts w:eastAsiaTheme="minorEastAsia"/>
+          <w:lang w:val="en-US"/>
+        </w:rPr>
+      </w:pPr>
+      <w:r>
+        <w:rPr>
+          <w:rFonts w:eastAsiaTheme="minorEastAsia"/>
+          <w:lang w:val="en-US"/>
+        </w:rPr>
+        <w:t>If the vector was 4</w:t>
+      </w:r>
+      <w:r>
+        <w:rPr>
+          <w:rFonts w:eastAsiaTheme="minorEastAsia"/>
+          <w:vertAlign w:val="superscript"/>
+          <w:lang w:val="en-US"/>
+        </w:rPr>
+        <w:t>th</w:t>
+      </w:r>
+      <w:r>
+        <w:rPr>
+          <w:rFonts w:eastAsiaTheme="minorEastAsia"/>
+          <w:lang w:val="en-US"/>
+        </w:rPr>
+        <w:t xml:space="preserve"> dimensional then the vector </w:t>
+      </w:r>
+      <m:oMath>
+        <m:r>
+          <w:rPr>
+            <w:rFonts w:ascii="Cambria Math" w:eastAsiaTheme="minorEastAsia" w:hAnsi="Cambria Math"/>
+            <w:lang w:val="en-US"/>
+          </w:rPr>
+          <m:t>(</m:t>
+        </m:r>
+        <m:sSub>
+          <m:sSubPr>
+            <m:ctrlPr>
+              <w:rPr>
+                <w:rFonts w:ascii="Cambria Math" w:eastAsiaTheme="minorEastAsia" w:hAnsi="Cambria Math"/>
+                <w:i/>
+                <w:lang w:val="en-US"/>
+              </w:rPr>
+            </m:ctrlPr>
+          </m:sSubPr>
+          <m:e>
+            <m:r>
+              <w:rPr>
+                <w:rFonts w:ascii="Cambria Math" w:eastAsiaTheme="minorEastAsia" w:hAnsi="Cambria Math"/>
+                <w:lang w:val="en-US"/>
+              </w:rPr>
+              <m:t>u</m:t>
+            </m:r>
+          </m:e>
+          <m:sub>
+            <m:r>
+              <w:rPr>
+                <w:rFonts w:ascii="Cambria Math" w:eastAsiaTheme="minorEastAsia" w:hAnsi="Cambria Math"/>
+                <w:lang w:val="en-US"/>
+              </w:rPr>
+              <m:t>1</m:t>
+            </m:r>
+          </m:sub>
+        </m:sSub>
+        <m:r>
+          <w:rPr>
+            <w:rFonts w:ascii="Cambria Math" w:eastAsiaTheme="minorEastAsia" w:hAnsi="Cambria Math"/>
+            <w:lang w:val="en-US"/>
+          </w:rPr>
+          <m:t xml:space="preserve">, </m:t>
+        </m:r>
+        <m:sSub>
+          <m:sSubPr>
+            <m:ctrlPr>
+              <w:rPr>
+                <w:rFonts w:ascii="Cambria Math" w:eastAsiaTheme="minorEastAsia" w:hAnsi="Cambria Math"/>
+                <w:i/>
+                <w:lang w:val="en-US"/>
+              </w:rPr>
+            </m:ctrlPr>
+          </m:sSubPr>
+          <m:e>
+            <m:r>
+              <w:rPr>
+                <w:rFonts w:ascii="Cambria Math" w:eastAsiaTheme="minorEastAsia" w:hAnsi="Cambria Math"/>
+                <w:lang w:val="en-US"/>
+              </w:rPr>
+              <m:t>u</m:t>
+            </m:r>
+          </m:e>
+          <m:sub>
+            <m:r>
+              <w:rPr>
+                <w:rFonts w:ascii="Cambria Math" w:eastAsiaTheme="minorEastAsia" w:hAnsi="Cambria Math"/>
+                <w:lang w:val="en-US"/>
+              </w:rPr>
+              <m:t>2</m:t>
+            </m:r>
+          </m:sub>
+        </m:sSub>
+        <m:r>
+          <w:rPr>
+            <w:rFonts w:ascii="Cambria Math" w:eastAsiaTheme="minorEastAsia" w:hAnsi="Cambria Math"/>
+            <w:lang w:val="en-US"/>
+          </w:rPr>
+          <m:t xml:space="preserve">, </m:t>
+        </m:r>
+        <m:sSub>
+          <m:sSubPr>
+            <m:ctrlPr>
+              <w:rPr>
+                <w:rFonts w:ascii="Cambria Math" w:eastAsiaTheme="minorEastAsia" w:hAnsi="Cambria Math"/>
+                <w:i/>
+                <w:lang w:val="en-US"/>
+              </w:rPr>
+            </m:ctrlPr>
+          </m:sSubPr>
+          <m:e>
+            <m:r>
+              <w:rPr>
+                <w:rFonts w:ascii="Cambria Math" w:eastAsiaTheme="minorEastAsia" w:hAnsi="Cambria Math"/>
+                <w:lang w:val="en-US"/>
+              </w:rPr>
+              <m:t>u</m:t>
+            </m:r>
+          </m:e>
+          <m:sub>
+            <m:r>
+              <w:rPr>
+                <w:rFonts w:ascii="Cambria Math" w:eastAsiaTheme="minorEastAsia" w:hAnsi="Cambria Math"/>
+                <w:lang w:val="en-US"/>
+              </w:rPr>
+              <m:t>3</m:t>
+            </m:r>
+          </m:sub>
+        </m:sSub>
+        <m:r>
+          <w:rPr>
+            <w:rFonts w:ascii="Cambria Math" w:eastAsiaTheme="minorEastAsia" w:hAnsi="Cambria Math"/>
+            <w:lang w:val="en-US"/>
+          </w:rPr>
+          <m:t>,0)</m:t>
+        </m:r>
+      </m:oMath>
+      <w:r>
+        <w:rPr>
+          <w:rFonts w:eastAsiaTheme="minorEastAsia"/>
+          <w:lang w:val="en-US"/>
+        </w:rPr>
+        <w:t xml:space="preserve"> would be perpendicular to the vector </w:t>
+      </w:r>
+      <m:oMath>
+        <m:d>
+          <m:dPr>
+            <m:ctrlPr>
+              <w:rPr>
+                <w:rFonts w:ascii="Cambria Math" w:eastAsiaTheme="minorEastAsia" w:hAnsi="Cambria Math"/>
+                <w:i/>
+                <w:lang w:val="en-US"/>
+              </w:rPr>
+            </m:ctrlPr>
+          </m:dPr>
+          <m:e>
+            <m:r>
+              <w:rPr>
+                <w:rFonts w:ascii="Cambria Math" w:eastAsiaTheme="minorEastAsia" w:hAnsi="Cambria Math"/>
+                <w:lang w:val="en-US"/>
+              </w:rPr>
+              <m:t xml:space="preserve">0, 0, 0, </m:t>
+            </m:r>
+            <m:sSub>
+              <m:sSubPr>
+                <m:ctrlPr>
+                  <w:rPr>
+                    <w:rFonts w:ascii="Cambria Math" w:eastAsiaTheme="minorEastAsia" w:hAnsi="Cambria Math"/>
+                    <w:i/>
+                    <w:lang w:val="en-US"/>
+                  </w:rPr>
+                </m:ctrlPr>
+              </m:sSubPr>
+              <m:e>
+                <m:r>
+                  <w:rPr>
+                    <w:rFonts w:ascii="Cambria Math" w:eastAsiaTheme="minorEastAsia" w:hAnsi="Cambria Math"/>
+                    <w:lang w:val="en-US"/>
+                  </w:rPr>
+                  <m:t>u</m:t>
+                </m:r>
+              </m:e>
+              <m:sub>
+                <m:r>
+                  <w:rPr>
+                    <w:rFonts w:ascii="Cambria Math" w:eastAsiaTheme="minorEastAsia" w:hAnsi="Cambria Math"/>
+                    <w:lang w:val="en-US"/>
+                  </w:rPr>
+                  <m:t>4</m:t>
+                </m:r>
+              </m:sub>
+            </m:sSub>
+          </m:e>
+        </m:d>
+        <m:r>
+          <w:rPr>
+            <w:rFonts w:ascii="Cambria Math" w:eastAsiaTheme="minorEastAsia" w:hAnsi="Cambria Math"/>
+            <w:lang w:val="en-US"/>
+          </w:rPr>
+          <m:t>,</m:t>
+        </m:r>
+      </m:oMath>
+      <w:r>
+        <w:rPr>
+          <w:rFonts w:eastAsiaTheme="minorEastAsia"/>
+          <w:lang w:val="en-US"/>
+        </w:rPr>
+        <w:t xml:space="preserve"> thus:</w:t>
+      </w:r>
+    </w:p>
+    <w:p>
+      <w:pPr>
+        <w:ind w:firstLine="708"/>
+        <w:rPr>
+          <w:rFonts w:eastAsiaTheme="minorEastAsia"/>
+          <w:lang w:val="en-US"/>
+        </w:rPr>
+      </w:pPr>
+      <m:oMathPara>
+        <m:oMath>
+          <m:sSub>
+            <m:sSubPr>
+              <m:ctrlPr>
+                <w:rPr>
+                  <w:rFonts w:ascii="Cambria Math" w:hAnsi="Cambria Math"/>
+                  <w:i/>
+                  <w:lang w:val="en-US"/>
+                </w:rPr>
+              </m:ctrlPr>
+            </m:sSubPr>
+            <m:e>
+              <m:r>
+                <w:rPr>
+                  <w:rFonts w:ascii="Cambria Math" w:hAnsi="Cambria Math"/>
+                  <w:lang w:val="en-US"/>
+                </w:rPr>
+                <m:t>l</m:t>
+              </m:r>
+            </m:e>
+            <m:sub>
+              <m:r>
+                <w:rPr>
+                  <w:rFonts w:ascii="Cambria Math" w:hAnsi="Cambria Math"/>
+                  <w:lang w:val="en-US"/>
+                </w:rPr>
+                <m:t>3</m:t>
+              </m:r>
+            </m:sub>
+          </m:sSub>
+          <m:r>
+            <w:rPr>
+              <w:rFonts w:ascii="Cambria Math" w:hAnsi="Cambria Math"/>
+              <w:lang w:val="en-US"/>
+            </w:rPr>
+            <m:t>=</m:t>
+          </m:r>
+          <m:rad>
+            <m:radPr>
+              <m:degHide m:val="1"/>
+              <m:ctrlPr>
+                <w:rPr>
+                  <w:rFonts w:ascii="Cambria Math" w:hAnsi="Cambria Math"/>
+                  <w:i/>
+                  <w:lang w:val="en-US"/>
+                </w:rPr>
+              </m:ctrlPr>
+            </m:radPr>
+            <m:deg/>
+            <m:e>
+              <m:sSubSup>
+                <m:sSubSupPr>
+                  <m:ctrlPr>
+                    <w:rPr>
+                      <w:rFonts w:ascii="Cambria Math" w:hAnsi="Cambria Math"/>
+                      <w:i/>
+                      <w:lang w:val="en-US"/>
+                    </w:rPr>
+                  </m:ctrlPr>
+                </m:sSubSupPr>
+                <m:e>
+                  <m:r>
+                    <w:rPr>
+                      <w:rFonts w:ascii="Cambria Math" w:hAnsi="Cambria Math"/>
+                      <w:lang w:val="en-US"/>
+                    </w:rPr>
+                    <m:t>l</m:t>
+                  </m:r>
+                </m:e>
+                <m:sub>
+                  <m:r>
+                    <w:rPr>
+                      <w:rFonts w:ascii="Cambria Math" w:hAnsi="Cambria Math"/>
+                      <w:lang w:val="en-US"/>
+                    </w:rPr>
+                    <m:t>2</m:t>
+                  </m:r>
+                </m:sub>
+                <m:sup>
+                  <m:r>
+                    <w:rPr>
+                      <w:rFonts w:ascii="Cambria Math" w:hAnsi="Cambria Math"/>
+                      <w:lang w:val="en-US"/>
+                    </w:rPr>
+                    <m:t>2</m:t>
+                  </m:r>
+                </m:sup>
+              </m:sSubSup>
+              <m:r>
+                <w:rPr>
+                  <w:rFonts w:ascii="Cambria Math" w:hAnsi="Cambria Math"/>
+                  <w:lang w:val="en-US"/>
+                </w:rPr>
+                <m:t>+</m:t>
+              </m:r>
+              <m:sSubSup>
+                <m:sSubSupPr>
+                  <m:ctrlPr>
+                    <w:rPr>
+                      <w:rFonts w:ascii="Cambria Math" w:hAnsi="Cambria Math"/>
+                      <w:i/>
+                      <w:lang w:val="en-US"/>
+                    </w:rPr>
+                  </m:ctrlPr>
+                </m:sSubSupPr>
+                <m:e>
+                  <m:r>
+                    <w:rPr>
+                      <w:rFonts w:ascii="Cambria Math" w:hAnsi="Cambria Math"/>
+                      <w:lang w:val="en-US"/>
+                    </w:rPr>
+                    <m:t>u</m:t>
+                  </m:r>
+                </m:e>
+                <m:sub>
+                  <m:r>
+                    <w:rPr>
+                      <w:rFonts w:ascii="Cambria Math" w:hAnsi="Cambria Math"/>
+                      <w:lang w:val="en-US"/>
+                    </w:rPr>
+                    <m:t>4</m:t>
+                  </m:r>
+                </m:sub>
+                <m:sup>
+                  <m:r>
+                    <w:rPr>
+                      <w:rFonts w:ascii="Cambria Math" w:hAnsi="Cambria Math"/>
+                      <w:lang w:val="en-US"/>
+                    </w:rPr>
+                    <m:t>2</m:t>
+                  </m:r>
+                </m:sup>
+              </m:sSubSup>
+            </m:e>
+          </m:rad>
+        </m:oMath>
+      </m:oMathPara>
+    </w:p>
+    <w:p>
+      <w:pPr>
+        <w:ind w:firstLine="708"/>
+        <w:rPr>
+          <w:rFonts w:eastAsiaTheme="minorEastAsia"/>
+          <w:lang w:val="en-US"/>
+        </w:rPr>
+      </w:pPr>
+      <w:r>
+        <w:rPr>
+          <w:rFonts w:eastAsiaTheme="minorEastAsia"/>
+          <w:lang w:val="en-US"/>
+        </w:rPr>
+        <w:t>If the vector was n</w:t>
+      </w:r>
+      <w:r>
+        <w:rPr>
+          <w:rFonts w:eastAsiaTheme="minorEastAsia"/>
+          <w:vertAlign w:val="superscript"/>
+          <w:lang w:val="en-US"/>
+        </w:rPr>
+        <w:t>t</w:t>
+      </w:r>
+      <w:r>
+        <w:rPr>
+          <w:rFonts w:eastAsiaTheme="minorEastAsia"/>
+          <w:vertAlign w:val="superscript"/>
+          <w:lang w:val="en-US"/>
+        </w:rPr>
+        <w:t>h</w:t>
+      </w:r>
+      <w:r>
+        <w:rPr>
+          <w:rFonts w:eastAsiaTheme="minorEastAsia"/>
+          <w:lang w:val="en-US"/>
+        </w:rPr>
+        <w:t xml:space="preserve"> dimensional, then the vector </w:t>
+      </w:r>
+      <m:oMath>
+        <m:r>
+          <w:rPr>
+            <w:rFonts w:ascii="Cambria Math" w:eastAsiaTheme="minorEastAsia" w:hAnsi="Cambria Math"/>
+            <w:lang w:val="en-US"/>
+          </w:rPr>
+          <m:t>(</m:t>
+        </m:r>
+        <m:sSub>
+          <m:sSubPr>
+            <m:ctrlPr>
+              <w:rPr>
+                <w:rFonts w:ascii="Cambria Math" w:eastAsiaTheme="minorEastAsia" w:hAnsi="Cambria Math"/>
+                <w:i/>
+                <w:lang w:val="en-US"/>
+              </w:rPr>
+            </m:ctrlPr>
+          </m:sSubPr>
+          <m:e>
+            <m:r>
+              <w:rPr>
+                <w:rFonts w:ascii="Cambria Math" w:eastAsiaTheme="minorEastAsia" w:hAnsi="Cambria Math"/>
+                <w:lang w:val="en-US"/>
+              </w:rPr>
+              <m:t>u</m:t>
+            </m:r>
+          </m:e>
+          <m:sub>
+            <m:r>
+              <w:rPr>
+                <w:rFonts w:ascii="Cambria Math" w:eastAsiaTheme="minorEastAsia" w:hAnsi="Cambria Math"/>
+                <w:lang w:val="en-US"/>
+              </w:rPr>
+              <m:t>1</m:t>
+            </m:r>
+          </m:sub>
+        </m:sSub>
+        <m:r>
+          <w:rPr>
+            <w:rFonts w:ascii="Cambria Math" w:eastAsiaTheme="minorEastAsia" w:hAnsi="Cambria Math"/>
+            <w:lang w:val="en-US"/>
+          </w:rPr>
+          <m:t>,</m:t>
+        </m:r>
+        <m:sSub>
+          <m:sSubPr>
+            <m:ctrlPr>
+              <w:rPr>
+                <w:rFonts w:ascii="Cambria Math" w:eastAsiaTheme="minorEastAsia" w:hAnsi="Cambria Math"/>
+                <w:i/>
+                <w:lang w:val="en-US"/>
+              </w:rPr>
+            </m:ctrlPr>
+          </m:sSubPr>
+          <m:e>
+            <m:r>
+              <w:rPr>
+                <w:rFonts w:ascii="Cambria Math" w:eastAsiaTheme="minorEastAsia" w:hAnsi="Cambria Math"/>
+                <w:lang w:val="en-US"/>
+              </w:rPr>
+              <m:t>u</m:t>
+            </m:r>
+          </m:e>
+          <m:sub>
+            <m:r>
+              <w:rPr>
+                <w:rFonts w:ascii="Cambria Math" w:eastAsiaTheme="minorEastAsia" w:hAnsi="Cambria Math"/>
+                <w:lang w:val="en-US"/>
+              </w:rPr>
+              <m:t>2</m:t>
+            </m:r>
+          </m:sub>
+        </m:sSub>
+        <m:r>
+          <w:rPr>
+            <w:rFonts w:ascii="Cambria Math" w:eastAsiaTheme="minorEastAsia" w:hAnsi="Cambria Math"/>
+            <w:lang w:val="en-US"/>
+          </w:rPr>
+          <m:t>,</m:t>
+        </m:r>
+        <m:sSub>
+          <m:sSubPr>
+            <m:ctrlPr>
+              <w:rPr>
+                <w:rFonts w:ascii="Cambria Math" w:eastAsiaTheme="minorEastAsia" w:hAnsi="Cambria Math"/>
+                <w:i/>
+                <w:lang w:val="en-US"/>
+              </w:rPr>
+            </m:ctrlPr>
+          </m:sSubPr>
+          <m:e>
+            <m:r>
+              <w:rPr>
+                <w:rFonts w:ascii="Cambria Math" w:eastAsiaTheme="minorEastAsia" w:hAnsi="Cambria Math"/>
+                <w:lang w:val="en-US"/>
+              </w:rPr>
+              <m:t>u</m:t>
+            </m:r>
+          </m:e>
+          <m:sub>
+            <m:r>
+              <w:rPr>
+                <w:rFonts w:ascii="Cambria Math" w:eastAsiaTheme="minorEastAsia" w:hAnsi="Cambria Math"/>
+                <w:lang w:val="en-US"/>
+              </w:rPr>
+              <m:t>3</m:t>
+            </m:r>
+          </m:sub>
+        </m:sSub>
+        <m:r>
+          <w:rPr>
+            <w:rFonts w:ascii="Cambria Math" w:eastAsiaTheme="minorEastAsia" w:hAnsi="Cambria Math"/>
+            <w:lang w:val="en-US"/>
+          </w:rPr>
+          <m:t>,…,</m:t>
+        </m:r>
+        <m:sSub>
+          <m:sSubPr>
+            <m:ctrlPr>
+              <w:rPr>
+                <w:rFonts w:ascii="Cambria Math" w:eastAsiaTheme="minorEastAsia" w:hAnsi="Cambria Math"/>
+                <w:i/>
+                <w:lang w:val="en-US"/>
+              </w:rPr>
+            </m:ctrlPr>
+          </m:sSubPr>
+          <m:e>
+            <m:r>
+              <w:rPr>
+                <w:rFonts w:ascii="Cambria Math" w:eastAsiaTheme="minorEastAsia" w:hAnsi="Cambria Math"/>
+                <w:lang w:val="en-US"/>
+              </w:rPr>
+              <m:t>u</m:t>
+            </m:r>
+          </m:e>
+          <m:sub>
+            <m:r>
+              <w:rPr>
+                <w:rFonts w:ascii="Cambria Math" w:eastAsiaTheme="minorEastAsia" w:hAnsi="Cambria Math"/>
+                <w:lang w:val="en-US"/>
+              </w:rPr>
+              <m:t>n-1</m:t>
+            </m:r>
+          </m:sub>
+        </m:sSub>
+        <m:r>
+          <w:rPr>
+            <w:rFonts w:ascii="Cambria Math" w:eastAsiaTheme="minorEastAsia" w:hAnsi="Cambria Math"/>
+            <w:lang w:val="en-US"/>
+          </w:rPr>
+          <m:t>,0)</m:t>
+        </m:r>
+      </m:oMath>
+      <w:r>
+        <w:rPr>
+          <w:rFonts w:eastAsiaTheme="minorEastAsia"/>
+          <w:lang w:val="en-US"/>
+        </w:rPr>
+        <w:t xml:space="preserve"> would be perpendicular to the vector </w:t>
+      </w:r>
+      <m:oMath>
+        <m:r>
+          <w:rPr>
+            <w:rFonts w:ascii="Cambria Math" w:eastAsiaTheme="minorEastAsia" w:hAnsi="Cambria Math"/>
+            <w:lang w:val="en-US"/>
+          </w:rPr>
+          <m:t>(0,0,0,…,0,</m:t>
+        </m:r>
+        <m:sSub>
+          <m:sSubPr>
+            <m:ctrlPr>
+              <w:rPr>
+                <w:rFonts w:ascii="Cambria Math" w:eastAsiaTheme="minorEastAsia" w:hAnsi="Cambria Math"/>
+                <w:i/>
+                <w:lang w:val="en-US"/>
+              </w:rPr>
+            </m:ctrlPr>
+          </m:sSubPr>
+          <m:e>
+            <m:r>
+              <w:rPr>
+                <w:rFonts w:ascii="Cambria Math" w:eastAsiaTheme="minorEastAsia" w:hAnsi="Cambria Math"/>
+                <w:lang w:val="en-US"/>
+              </w:rPr>
+              <m:t>u</m:t>
+            </m:r>
+          </m:e>
+          <m:sub>
+            <m:r>
+              <w:rPr>
+                <w:rFonts w:ascii="Cambria Math" w:eastAsiaTheme="minorEastAsia" w:hAnsi="Cambria Math"/>
+                <w:lang w:val="en-US"/>
+              </w:rPr>
+              <m:t>n</m:t>
+            </m:r>
+          </m:sub>
+        </m:sSub>
+        <m:r>
+          <w:rPr>
+            <w:rFonts w:ascii="Cambria Math" w:eastAsiaTheme="minorEastAsia" w:hAnsi="Cambria Math"/>
+            <w:lang w:val="en-US"/>
+          </w:rPr>
+          <m:t>)</m:t>
+        </m:r>
+      </m:oMath>
+      <w:r>
+        <w:rPr>
+          <w:rFonts w:eastAsiaTheme="minorEastAsia"/>
+          <w:lang w:val="en-US"/>
+        </w:rPr>
+        <w:t>, thus:</w:t>
+      </w:r>
+    </w:p>
+    <w:p>
+      <w:pPr>
+        <w:ind w:firstLine="708"/>
+        <w:rPr>
+          <w:rFonts w:eastAsiaTheme="minorEastAsia"/>
+          <w:lang w:val="en-US"/>
+        </w:rPr>
+      </w:pPr>
+      <m:oMathPara>
+        <m:oMath>
+          <m:sSub>
+            <m:sSubPr>
+              <m:ctrlPr>
+                <w:rPr>
+                  <w:rFonts w:ascii="Cambria Math" w:hAnsi="Cambria Math"/>
+                  <w:i/>
+                  <w:lang w:val="en-US"/>
+                </w:rPr>
+              </m:ctrlPr>
+            </m:sSubPr>
+            <m:e>
+              <m:r>
+                <w:rPr>
+                  <w:rFonts w:ascii="Cambria Math" w:hAnsi="Cambria Math"/>
+                  <w:lang w:val="en-US"/>
+                </w:rPr>
+                <m:t>l</m:t>
+              </m:r>
+            </m:e>
+            <m:sub>
+              <m:r>
+                <w:rPr>
+                  <w:rFonts w:ascii="Cambria Math" w:hAnsi="Cambria Math"/>
+                  <w:lang w:val="en-US"/>
+                </w:rPr>
+                <m:t>n-1</m:t>
+              </m:r>
+            </m:sub>
+          </m:sSub>
+          <m:r>
+            <w:rPr>
+              <w:rFonts w:ascii="Cambria Math" w:hAnsi="Cambria Math"/>
+              <w:lang w:val="en-US"/>
+            </w:rPr>
+            <m:t>=</m:t>
+          </m:r>
+          <m:rad>
+            <m:radPr>
+              <m:degHide m:val="1"/>
+              <m:ctrlPr>
+                <w:rPr>
+                  <w:rFonts w:ascii="Cambria Math" w:hAnsi="Cambria Math"/>
+                  <w:i/>
+                  <w:lang w:val="en-US"/>
+                </w:rPr>
+              </m:ctrlPr>
+            </m:radPr>
+            <m:deg/>
+            <m:e>
+              <m:sSubSup>
+                <m:sSubSupPr>
+                  <m:ctrlPr>
+                    <w:rPr>
+                      <w:rFonts w:ascii="Cambria Math" w:hAnsi="Cambria Math"/>
+                      <w:i/>
+                      <w:lang w:val="en-US"/>
+                    </w:rPr>
+                  </m:ctrlPr>
+                </m:sSubSupPr>
+                <m:e>
+                  <m:r>
+                    <w:rPr>
+                      <w:rFonts w:ascii="Cambria Math" w:hAnsi="Cambria Math"/>
+                      <w:lang w:val="en-US"/>
+                    </w:rPr>
+                    <m:t>l</m:t>
+                  </m:r>
+                </m:e>
+                <m:sub>
+                  <m:r>
+                    <w:rPr>
+                      <w:rFonts w:ascii="Cambria Math" w:hAnsi="Cambria Math"/>
+                      <w:lang w:val="en-US"/>
+                    </w:rPr>
+                    <m:t>n-2</m:t>
+                  </m:r>
+                </m:sub>
+                <m:sup>
+                  <m:r>
+                    <w:rPr>
+                      <w:rFonts w:ascii="Cambria Math" w:hAnsi="Cambria Math"/>
+                      <w:lang w:val="en-US"/>
+                    </w:rPr>
+                    <m:t>2</m:t>
+                  </m:r>
+                </m:sup>
+              </m:sSubSup>
+              <m:r>
+                <w:rPr>
+                  <w:rFonts w:ascii="Cambria Math" w:hAnsi="Cambria Math"/>
+                  <w:lang w:val="en-US"/>
+                </w:rPr>
+                <m:t>+</m:t>
+              </m:r>
+              <m:sSubSup>
+                <m:sSubSupPr>
+                  <m:ctrlPr>
+                    <w:rPr>
+                      <w:rFonts w:ascii="Cambria Math" w:hAnsi="Cambria Math"/>
+                      <w:i/>
+                      <w:lang w:val="en-US"/>
+                    </w:rPr>
+                  </m:ctrlPr>
+                </m:sSubSupPr>
+                <m:e>
+                  <m:r>
+                    <w:rPr>
+                      <w:rFonts w:ascii="Cambria Math" w:hAnsi="Cambria Math"/>
+                      <w:lang w:val="en-US"/>
+                    </w:rPr>
+                    <m:t>u</m:t>
+                  </m:r>
+                </m:e>
+                <m:sub>
+                  <m:r>
+                    <w:rPr>
+                      <w:rFonts w:ascii="Cambria Math" w:hAnsi="Cambria Math"/>
+                      <w:lang w:val="en-US"/>
+                    </w:rPr>
+                    <m:t>n</m:t>
+                  </m:r>
+                </m:sub>
+                <m:sup>
+                  <m:r>
+                    <w:rPr>
+                      <w:rFonts w:ascii="Cambria Math" w:hAnsi="Cambria Math"/>
+                      <w:lang w:val="en-US"/>
+                    </w:rPr>
+                    <m:t>2</m:t>
+                  </m:r>
+                </m:sup>
+              </m:sSubSup>
+            </m:e>
+          </m:rad>
+        </m:oMath>
+      </m:oMathPara>
+    </w:p>
+    <w:p>
+      <w:pPr>
+        <w:rPr>
+          <w:rFonts w:eastAsiaTheme="minorEastAsia"/>
+          <w:lang w:val="en-US"/>
+        </w:rPr>
+      </w:pPr>
+      <w:r>
+        <w:rPr>
+          <w:rFonts w:eastAsiaTheme="minorEastAsia"/>
+          <w:lang w:val="en-US"/>
+        </w:rPr>
+        <w:tab/>
+        <w:t>Replacing all the lengths we get:</w:t>
+      </w:r>
+    </w:p>
+    <w:p>
+      <w:pPr>
+        <w:rPr>
+          <w:lang w:val="en-US"/>
+        </w:rPr>
+      </w:pPr>
+      <m:oMathPara>
+        <m:oMath>
+          <m:sSub>
+            <m:sSubPr>
+              <m:ctrlPr>
+                <w:rPr>
+                  <w:rFonts w:ascii="Cambria Math" w:hAnsi="Cambria Math"/>
+                  <w:i/>
+                  <w:lang w:val="en-US"/>
+                </w:rPr>
+              </m:ctrlPr>
+            </m:sSubPr>
+            <m:e>
+              <m:r>
+                <w:rPr>
+                  <w:rFonts w:ascii="Cambria Math" w:hAnsi="Cambria Math"/>
+                  <w:lang w:val="en-US"/>
+                </w:rPr>
+                <m:t>l</m:t>
+              </m:r>
+            </m:e>
+            <m:sub>
+              <m:r>
+                <w:rPr>
+                  <w:rFonts w:ascii="Cambria Math" w:hAnsi="Cambria Math"/>
+                  <w:lang w:val="en-US"/>
+                </w:rPr>
+                <m:t>n-1</m:t>
+              </m:r>
+            </m:sub>
+          </m:sSub>
+          <m:r>
+            <w:rPr>
+              <w:rFonts w:ascii="Cambria Math" w:hAnsi="Cambria Math"/>
+              <w:lang w:val="en-US"/>
+            </w:rPr>
+            <m:t>=</m:t>
+          </m:r>
+          <m:rad>
+            <m:radPr>
+              <m:degHide m:val="1"/>
+              <m:ctrlPr>
+                <w:rPr>
+                  <w:rFonts w:ascii="Cambria Math" w:hAnsi="Cambria Math"/>
+                  <w:i/>
+                  <w:lang w:val="en-US"/>
+                </w:rPr>
+              </m:ctrlPr>
+            </m:radPr>
+            <m:deg/>
+            <m:e>
+              <m:sSup>
+                <m:sSupPr>
+                  <m:ctrlPr>
+                    <w:rPr>
+                      <w:rFonts w:ascii="Cambria Math" w:hAnsi="Cambria Math"/>
+                      <w:i/>
+                      <w:lang w:val="en-US"/>
+                    </w:rPr>
+                  </m:ctrlPr>
+                </m:sSupPr>
+                <m:e>
+                  <m:rad>
+                    <m:radPr>
+                      <m:degHide m:val="1"/>
+                      <m:ctrlPr>
+                        <w:rPr>
+                          <w:rFonts w:ascii="Cambria Math" w:hAnsi="Cambria Math"/>
+                          <w:i/>
+                          <w:lang w:val="en-US"/>
+                        </w:rPr>
+                      </m:ctrlPr>
+                    </m:radPr>
+                    <m:deg/>
+                    <m:e>
+                      <m:sSubSup>
+                        <m:sSubSupPr>
+                          <m:ctrlPr>
+                            <w:rPr>
+                              <w:rFonts w:ascii="Cambria Math" w:hAnsi="Cambria Math"/>
+                              <w:i/>
+                              <w:lang w:val="en-US"/>
+                            </w:rPr>
+                          </m:ctrlPr>
+                        </m:sSubSupPr>
+                        <m:e>
+                          <m:r>
+                            <w:rPr>
+                              <w:rFonts w:ascii="Cambria Math" w:hAnsi="Cambria Math"/>
+                              <w:lang w:val="en-US"/>
+                            </w:rPr>
+                            <m:t>l</m:t>
+                          </m:r>
+                        </m:e>
+                        <m:sub>
+                          <m:r>
+                            <w:rPr>
+                              <w:rFonts w:ascii="Cambria Math" w:hAnsi="Cambria Math"/>
+                              <w:lang w:val="en-US"/>
+                            </w:rPr>
+                            <m:t>n-3</m:t>
+                          </m:r>
+                        </m:sub>
+                        <m:sup>
+                          <m:r>
+                            <w:rPr>
+                              <w:rFonts w:ascii="Cambria Math" w:hAnsi="Cambria Math"/>
+                              <w:lang w:val="en-US"/>
+                            </w:rPr>
+                            <m:t>2</m:t>
+                          </m:r>
+                        </m:sup>
+                      </m:sSubSup>
+                      <m:r>
+                        <w:rPr>
+                          <w:rFonts w:ascii="Cambria Math" w:hAnsi="Cambria Math"/>
+                          <w:lang w:val="en-US"/>
+                        </w:rPr>
+                        <m:t>+</m:t>
+                      </m:r>
+                      <m:sSubSup>
+                        <m:sSubSupPr>
+                          <m:ctrlPr>
+                            <w:rPr>
+                              <w:rFonts w:ascii="Cambria Math" w:hAnsi="Cambria Math"/>
+                              <w:i/>
+                              <w:lang w:val="en-US"/>
+                            </w:rPr>
+                          </m:ctrlPr>
+                        </m:sSubSupPr>
+                        <m:e>
+                          <m:r>
+                            <w:rPr>
+                              <w:rFonts w:ascii="Cambria Math" w:hAnsi="Cambria Math"/>
+                              <w:lang w:val="en-US"/>
+                            </w:rPr>
+                            <m:t>u</m:t>
+                          </m:r>
+                        </m:e>
+                        <m:sub>
+                          <m:r>
+                            <w:rPr>
+                              <w:rFonts w:ascii="Cambria Math" w:hAnsi="Cambria Math"/>
+                              <w:lang w:val="en-US"/>
+                            </w:rPr>
+                            <m:t>n-1</m:t>
+                          </m:r>
+                        </m:sub>
+                        <m:sup>
+                          <m:r>
+                            <w:rPr>
+                              <w:rFonts w:ascii="Cambria Math" w:hAnsi="Cambria Math"/>
+                              <w:lang w:val="en-US"/>
+                            </w:rPr>
+                            <m:t>2</m:t>
+                          </m:r>
+                        </m:sup>
+                      </m:sSubSup>
+                    </m:e>
+                  </m:rad>
+                </m:e>
+                <m:sup>
+                  <m:r>
+                    <w:rPr>
+                      <w:rFonts w:ascii="Cambria Math" w:hAnsi="Cambria Math"/>
+                      <w:lang w:val="en-US"/>
+                    </w:rPr>
+                    <m:t>2</m:t>
+                  </m:r>
+                </m:sup>
+              </m:sSup>
+              <m:r>
+                <w:rPr>
+                  <w:rFonts w:ascii="Cambria Math" w:hAnsi="Cambria Math"/>
+                  <w:lang w:val="en-US"/>
+                </w:rPr>
+                <m:t>+</m:t>
+              </m:r>
+              <m:sSubSup>
+                <m:sSubSupPr>
+                  <m:ctrlPr>
+                    <w:rPr>
+                      <w:rFonts w:ascii="Cambria Math" w:hAnsi="Cambria Math"/>
+                      <w:i/>
+                      <w:lang w:val="en-US"/>
+                    </w:rPr>
+                  </m:ctrlPr>
+                </m:sSubSupPr>
+                <m:e>
+                  <m:r>
+                    <w:rPr>
+                      <w:rFonts w:ascii="Cambria Math" w:hAnsi="Cambria Math"/>
+                      <w:lang w:val="en-US"/>
+                    </w:rPr>
+                    <m:t>u</m:t>
+                  </m:r>
+                </m:e>
+                <m:sub>
+                  <m:r>
+                    <w:rPr>
+                      <w:rFonts w:ascii="Cambria Math" w:hAnsi="Cambria Math"/>
+                      <w:lang w:val="en-US"/>
+                    </w:rPr>
+                    <m:t>n</m:t>
+                  </m:r>
+                </m:sub>
+                <m:sup>
+                  <m:r>
+                    <w:rPr>
+                      <w:rFonts w:ascii="Cambria Math" w:hAnsi="Cambria Math"/>
+                      <w:lang w:val="en-US"/>
+                    </w:rPr>
+                    <m:t>2</m:t>
+                  </m:r>
+                </m:sup>
+              </m:sSubSup>
+            </m:e>
+          </m:rad>
+          <m:r>
+            <w:rPr>
+              <w:rFonts w:ascii="Cambria Math" w:eastAsiaTheme="minorEastAsia" w:hAnsi="Cambria Math"/>
+              <w:lang w:val="en-US"/>
+            </w:rPr>
+            <m:t>=</m:t>
+          </m:r>
+          <m:rad>
+            <m:radPr>
+              <m:degHide m:val="1"/>
+              <m:ctrlPr>
+                <w:rPr>
+                  <w:rFonts w:ascii="Cambria Math" w:eastAsiaTheme="minorEastAsia" w:hAnsi="Cambria Math"/>
+                  <w:i/>
+                  <w:lang w:val="en-US"/>
+                </w:rPr>
+              </m:ctrlPr>
+            </m:radPr>
+            <m:deg>
+              <m:ctrlPr>
+                <w:rPr>
+                  <w:rFonts w:ascii="Cambria Math" w:hAnsi="Cambria Math"/>
+                  <w:i/>
+                  <w:lang w:val="en-US"/>
+                </w:rPr>
+              </m:ctrlPr>
+            </m:deg>
+            <m:e>
+              <m:sSubSup>
+                <m:sSubSupPr>
+                  <m:ctrlPr>
+                    <w:rPr>
+                      <w:rFonts w:ascii="Cambria Math" w:hAnsi="Cambria Math"/>
+                      <w:i/>
+                      <w:lang w:val="en-US"/>
+                    </w:rPr>
+                  </m:ctrlPr>
+                </m:sSubSupPr>
+                <m:e>
+                  <m:r>
+                    <w:rPr>
+                      <w:rFonts w:ascii="Cambria Math" w:hAnsi="Cambria Math"/>
+                      <w:lang w:val="en-US"/>
+                    </w:rPr>
+                    <m:t>u</m:t>
+                  </m:r>
+                </m:e>
+                <m:sub>
+                  <m:r>
+                    <w:rPr>
+                      <w:rFonts w:ascii="Cambria Math" w:hAnsi="Cambria Math"/>
+                      <w:lang w:val="en-US"/>
+                    </w:rPr>
+                    <m:t>1</m:t>
+                  </m:r>
+                </m:sub>
+                <m:sup>
+                  <m:r>
+                    <w:rPr>
+                      <w:rFonts w:ascii="Cambria Math" w:hAnsi="Cambria Math"/>
+                      <w:lang w:val="en-US"/>
+                    </w:rPr>
+                    <m:t>2</m:t>
+                  </m:r>
+                </m:sup>
+              </m:sSubSup>
+              <m:r>
+                <w:rPr>
+                  <w:rFonts w:ascii="Cambria Math" w:hAnsi="Cambria Math"/>
+                  <w:lang w:val="en-US"/>
+                </w:rPr>
+                <m:t>+</m:t>
+              </m:r>
+              <m:sSubSup>
+                <m:sSubSupPr>
+                  <m:ctrlPr>
+                    <w:rPr>
+                      <w:rFonts w:ascii="Cambria Math" w:hAnsi="Cambria Math"/>
+                      <w:i/>
+                      <w:lang w:val="en-US"/>
+                    </w:rPr>
+                  </m:ctrlPr>
+                </m:sSubSupPr>
+                <m:e>
+                  <m:r>
+                    <w:rPr>
+                      <w:rFonts w:ascii="Cambria Math" w:hAnsi="Cambria Math"/>
+                      <w:lang w:val="en-US"/>
+                    </w:rPr>
+                    <m:t>u</m:t>
+                  </m:r>
+                </m:e>
+                <m:sub>
+                  <m:r>
+                    <w:rPr>
+                      <w:rFonts w:ascii="Cambria Math" w:hAnsi="Cambria Math"/>
+                      <w:lang w:val="en-US"/>
+                    </w:rPr>
+                    <m:t>2</m:t>
+                  </m:r>
+                </m:sub>
+                <m:sup>
+                  <m:r>
+                    <w:rPr>
+                      <w:rFonts w:ascii="Cambria Math" w:hAnsi="Cambria Math"/>
+                      <w:lang w:val="en-US"/>
+                    </w:rPr>
+                    <m:t>2</m:t>
+                  </m:r>
+                </m:sup>
+              </m:sSubSup>
+              <m:r>
+                <w:rPr>
+                  <w:rFonts w:ascii="Cambria Math" w:hAnsi="Cambria Math"/>
+                  <w:lang w:val="en-US"/>
+                </w:rPr>
+                <m:t>+…+</m:t>
+              </m:r>
+              <m:sSubSup>
+                <m:sSubSupPr>
+                  <m:ctrlPr>
+                    <w:rPr>
+                      <w:rFonts w:ascii="Cambria Math" w:hAnsi="Cambria Math"/>
+                      <w:i/>
+                      <w:lang w:val="en-US"/>
+                    </w:rPr>
+                  </m:ctrlPr>
+                </m:sSubSupPr>
+                <m:e>
+                  <m:r>
+                    <w:rPr>
+                      <w:rFonts w:ascii="Cambria Math" w:hAnsi="Cambria Math"/>
+                      <w:lang w:val="en-US"/>
+                    </w:rPr>
+                    <m:t>u</m:t>
+                  </m:r>
+                </m:e>
+                <m:sub>
+                  <m:r>
+                    <w:rPr>
+                      <w:rFonts w:ascii="Cambria Math" w:hAnsi="Cambria Math"/>
+                      <w:lang w:val="en-US"/>
+                    </w:rPr>
+                    <m:t>n</m:t>
+                  </m:r>
+                </m:sub>
+                <m:sup>
+                  <m:r>
+                    <w:rPr>
+                      <w:rFonts w:ascii="Cambria Math" w:hAnsi="Cambria Math"/>
+                      <w:lang w:val="en-US"/>
+                    </w:rPr>
+                    <m:t>2</m:t>
+                  </m:r>
+                </m:sup>
+              </m:sSubSup>
+            </m:e>
+          </m:rad>
+          <m:r>
+            <w:rPr>
+              <w:rFonts w:ascii="Cambria Math" w:eastAsiaTheme="minorEastAsia" w:hAnsi="Cambria Math"/>
+              <w:lang w:val="en-US"/>
+            </w:rPr>
+            <m:t>=</m:t>
+          </m:r>
+          <m:rad>
+            <m:radPr>
+              <m:degHide m:val="1"/>
+              <m:ctrlPr>
+                <w:rPr>
+                  <w:rFonts w:ascii="Cambria Math" w:eastAsiaTheme="minorEastAsia" w:hAnsi="Cambria Math"/>
+                  <w:i/>
+                  <w:lang w:val="en-US"/>
+                </w:rPr>
+              </m:ctrlPr>
+            </m:radPr>
+            <m:deg>
+              <m:ctrlPr>
+                <w:rPr>
+                  <w:rFonts w:ascii="Cambria Math" w:hAnsi="Cambria Math"/>
+                  <w:i/>
+                  <w:lang w:val="en-US"/>
+                </w:rPr>
+              </m:ctrlPr>
+            </m:deg>
+            <m:e>
+              <m:r>
+                <m:rPr>
+                  <m:sty m:val="bi"/>
+                </m:rPr>
+                <w:rPr>
+                  <w:rFonts w:ascii="Cambria Math" w:hAnsi="Cambria Math"/>
+                  <w:lang w:val="en-US"/>
+                </w:rPr>
+                <m:t>u∙u</m:t>
+              </m:r>
+            </m:e>
+          </m:rad>
+        </m:oMath>
+      </m:oMathPara>
+    </w:p>
+    <w:p>
+      <w:pPr>
+        <w:pStyle w:val="Heading2"/>
         <w:rPr>
           <w:rFonts w:eastAsiaTheme="minorEastAsia"/>
           <w:lang w:val="en-US"/>
@@ -7561,7 +10579,7 @@
     </w:p>
     <w:p>
       <w:pPr>
-        <w:pStyle w:val="Heading1"/>
+        <w:pStyle w:val="Heading2"/>
         <w:rPr>
           <w:rFonts w:eastAsiaTheme="minorEastAsia"/>
           <w:lang w:val="en-US"/>
@@ -8645,6 +11663,1373 @@
     </w:p>
     <w:p>
       <w:pPr>
+        <w:pStyle w:val="Heading2"/>
+        <w:rPr>
+          <w:rFonts w:eastAsiaTheme="minorEastAsia"/>
+          <w:lang w:val="en-US"/>
+        </w:rPr>
+      </w:pPr>
+      <w:r>
+        <w:rPr>
+          <w:rFonts w:eastAsiaTheme="minorEastAsia"/>
+          <w:lang w:val="en-US"/>
+        </w:rPr>
+        <w:lastRenderedPageBreak/>
+        <w:t>Schwartz Inequality</w:t>
+      </w:r>
+    </w:p>
+    <w:p>
+      <w:pPr>
+        <w:ind w:firstLine="576"/>
+        <w:rPr>
+          <w:rFonts w:eastAsiaTheme="minorEastAsia"/>
+          <w:lang w:val="en-US"/>
+        </w:rPr>
+      </w:pPr>
+      <w:r>
+        <w:rPr>
+          <w:lang w:val="en-US"/>
+        </w:rPr>
+        <w:t xml:space="preserve">Let </w:t>
+      </w:r>
+      <m:oMath>
+        <m:r>
+          <m:rPr>
+            <m:sty m:val="bi"/>
+          </m:rPr>
+          <w:rPr>
+            <w:rFonts w:ascii="Cambria Math" w:hAnsi="Cambria Math"/>
+            <w:lang w:val="en-US"/>
+          </w:rPr>
+          <m:t>u,v∈</m:t>
+        </m:r>
+        <m:sSup>
+          <m:sSupPr>
+            <m:ctrlPr>
+              <w:rPr>
+                <w:rFonts w:ascii="Cambria Math" w:hAnsi="Cambria Math"/>
+                <w:i/>
+                <w:lang w:val="en-US"/>
+              </w:rPr>
+            </m:ctrlPr>
+          </m:sSupPr>
+          <m:e>
+            <m:r>
+              <m:rPr>
+                <m:scr m:val="double-struck"/>
+              </m:rPr>
+              <w:rPr>
+                <w:rFonts w:ascii="Cambria Math" w:hAnsi="Cambria Math"/>
+                <w:lang w:val="en-US"/>
+              </w:rPr>
+              <m:t>R</m:t>
+            </m:r>
+            <m:ctrlPr>
+              <w:rPr>
+                <w:rFonts w:ascii="Cambria Math" w:hAnsi="Cambria Math"/>
+                <w:b/>
+                <w:bCs/>
+                <w:i/>
+                <w:lang w:val="en-US"/>
+              </w:rPr>
+            </m:ctrlPr>
+          </m:e>
+          <m:sup>
+            <m:r>
+              <w:rPr>
+                <w:rFonts w:ascii="Cambria Math" w:hAnsi="Cambria Math"/>
+                <w:lang w:val="en-US"/>
+              </w:rPr>
+              <m:t>n</m:t>
+            </m:r>
+          </m:sup>
+        </m:sSup>
+      </m:oMath>
+      <w:r>
+        <w:rPr>
+          <w:rFonts w:eastAsiaTheme="minorEastAsia"/>
+          <w:lang w:val="en-US"/>
+        </w:rPr>
+        <w:t xml:space="preserve"> be nonzero vectors. We know that we can force both vectors to become unit vectors by scaling them by the length:</w:t>
+      </w:r>
+    </w:p>
+    <w:p>
+      <w:pPr>
+        <w:ind w:firstLine="576"/>
+        <w:rPr>
+          <w:rFonts w:eastAsiaTheme="minorEastAsia"/>
+          <w:b/>
+          <w:bCs/>
+          <w:lang w:val="en-US"/>
+        </w:rPr>
+      </w:pPr>
+      <m:oMathPara>
+        <m:oMath>
+          <m:r>
+            <m:rPr>
+              <m:sty m:val="bi"/>
+            </m:rPr>
+            <w:rPr>
+              <w:rFonts w:ascii="Cambria Math" w:hAnsi="Cambria Math"/>
+              <w:lang w:val="en-US"/>
+            </w:rPr>
+            <m:t>U=</m:t>
+          </m:r>
+          <m:f>
+            <m:fPr>
+              <m:ctrlPr>
+                <w:rPr>
+                  <w:rFonts w:ascii="Cambria Math" w:hAnsi="Cambria Math"/>
+                  <w:b/>
+                  <w:bCs/>
+                  <w:i/>
+                  <w:lang w:val="en-US"/>
+                </w:rPr>
+              </m:ctrlPr>
+            </m:fPr>
+            <m:num>
+              <m:r>
+                <m:rPr>
+                  <m:sty m:val="bi"/>
+                </m:rPr>
+                <w:rPr>
+                  <w:rFonts w:ascii="Cambria Math" w:hAnsi="Cambria Math"/>
+                  <w:lang w:val="en-US"/>
+                </w:rPr>
+                <m:t>u</m:t>
+              </m:r>
+              <m:ctrlPr>
+                <w:rPr>
+                  <w:rFonts w:ascii="Cambria Math" w:hAnsi="Cambria Math"/>
+                  <w:i/>
+                  <w:lang w:val="en-US"/>
+                </w:rPr>
+              </m:ctrlPr>
+            </m:num>
+            <m:den>
+              <m:d>
+                <m:dPr>
+                  <m:begChr m:val="‖"/>
+                  <m:endChr m:val="‖"/>
+                  <m:ctrlPr>
+                    <w:rPr>
+                      <w:rFonts w:ascii="Cambria Math" w:hAnsi="Cambria Math"/>
+                      <w:i/>
+                      <w:lang w:val="en-US"/>
+                    </w:rPr>
+                  </m:ctrlPr>
+                </m:dPr>
+                <m:e>
+                  <m:r>
+                    <m:rPr>
+                      <m:sty m:val="bi"/>
+                    </m:rPr>
+                    <w:rPr>
+                      <w:rFonts w:ascii="Cambria Math" w:hAnsi="Cambria Math"/>
+                      <w:lang w:val="en-US"/>
+                    </w:rPr>
+                    <m:t>u</m:t>
+                  </m:r>
+                </m:e>
+              </m:d>
+            </m:den>
+          </m:f>
+        </m:oMath>
+      </m:oMathPara>
+    </w:p>
+    <w:p>
+      <w:pPr>
+        <w:ind w:firstLine="576"/>
+        <w:rPr>
+          <w:lang w:val="en-US"/>
+        </w:rPr>
+      </w:pPr>
+      <m:oMathPara>
+        <m:oMath>
+          <m:r>
+            <m:rPr>
+              <m:sty m:val="bi"/>
+            </m:rPr>
+            <w:rPr>
+              <w:rFonts w:ascii="Cambria Math" w:hAnsi="Cambria Math"/>
+              <w:lang w:val="en-US"/>
+            </w:rPr>
+            <m:t>V=</m:t>
+          </m:r>
+          <m:f>
+            <m:fPr>
+              <m:ctrlPr>
+                <w:rPr>
+                  <w:rFonts w:ascii="Cambria Math" w:hAnsi="Cambria Math"/>
+                  <w:b/>
+                  <w:bCs/>
+                  <w:i/>
+                  <w:lang w:val="en-US"/>
+                </w:rPr>
+              </m:ctrlPr>
+            </m:fPr>
+            <m:num>
+              <m:r>
+                <m:rPr>
+                  <m:sty m:val="bi"/>
+                </m:rPr>
+                <w:rPr>
+                  <w:rFonts w:ascii="Cambria Math" w:hAnsi="Cambria Math"/>
+                  <w:lang w:val="en-US"/>
+                </w:rPr>
+                <m:t>v</m:t>
+              </m:r>
+              <m:ctrlPr>
+                <w:rPr>
+                  <w:rFonts w:ascii="Cambria Math" w:hAnsi="Cambria Math"/>
+                  <w:i/>
+                  <w:lang w:val="en-US"/>
+                </w:rPr>
+              </m:ctrlPr>
+            </m:num>
+            <m:den>
+              <m:d>
+                <m:dPr>
+                  <m:begChr m:val="‖"/>
+                  <m:endChr m:val="‖"/>
+                  <m:ctrlPr>
+                    <w:rPr>
+                      <w:rFonts w:ascii="Cambria Math" w:hAnsi="Cambria Math"/>
+                      <w:i/>
+                      <w:lang w:val="en-US"/>
+                    </w:rPr>
+                  </m:ctrlPr>
+                </m:dPr>
+                <m:e>
+                  <m:r>
+                    <m:rPr>
+                      <m:sty m:val="bi"/>
+                    </m:rPr>
+                    <w:rPr>
+                      <w:rFonts w:ascii="Cambria Math" w:hAnsi="Cambria Math"/>
+                      <w:lang w:val="en-US"/>
+                    </w:rPr>
+                    <m:t>v</m:t>
+                  </m:r>
+                </m:e>
+              </m:d>
+            </m:den>
+          </m:f>
+        </m:oMath>
+      </m:oMathPara>
+    </w:p>
+    <w:p>
+      <w:pPr>
+        <w:ind w:firstLine="576"/>
+        <w:rPr>
+          <w:lang w:val="en-US"/>
+        </w:rPr>
+      </w:pPr>
+      <w:r>
+        <w:rPr>
+          <w:lang w:val="en-US"/>
+        </w:rPr>
+        <w:t>We also know that the dot product has the following formula:</w:t>
+      </w:r>
+    </w:p>
+    <w:p>
+      <w:pPr>
+        <w:ind w:firstLine="576"/>
+        <w:rPr>
+          <w:rFonts w:eastAsiaTheme="minorEastAsia"/>
+          <w:lang w:val="en-US"/>
+        </w:rPr>
+      </w:pPr>
+      <m:oMathPara>
+        <m:oMath>
+          <m:r>
+            <m:rPr>
+              <m:sty m:val="bi"/>
+            </m:rPr>
+            <w:rPr>
+              <w:rFonts w:ascii="Cambria Math" w:hAnsi="Cambria Math"/>
+              <w:lang w:val="en-US"/>
+            </w:rPr>
+            <m:t>u∙v=</m:t>
+          </m:r>
+          <m:d>
+            <m:dPr>
+              <m:begChr m:val="‖"/>
+              <m:endChr m:val="‖"/>
+              <m:ctrlPr>
+                <w:rPr>
+                  <w:rFonts w:ascii="Cambria Math" w:hAnsi="Cambria Math"/>
+                  <w:i/>
+                  <w:lang w:val="en-US"/>
+                </w:rPr>
+              </m:ctrlPr>
+            </m:dPr>
+            <m:e>
+              <m:r>
+                <m:rPr>
+                  <m:sty m:val="bi"/>
+                </m:rPr>
+                <w:rPr>
+                  <w:rFonts w:ascii="Cambria Math" w:hAnsi="Cambria Math"/>
+                  <w:lang w:val="en-US"/>
+                </w:rPr>
+                <m:t>u</m:t>
+              </m:r>
+            </m:e>
+          </m:d>
+          <m:r>
+            <w:rPr>
+              <w:rFonts w:ascii="Cambria Math" w:hAnsi="Cambria Math"/>
+              <w:lang w:val="en-US"/>
+            </w:rPr>
+            <m:t>∙</m:t>
+          </m:r>
+          <m:d>
+            <m:dPr>
+              <m:begChr m:val="‖"/>
+              <m:endChr m:val="‖"/>
+              <m:ctrlPr>
+                <w:rPr>
+                  <w:rFonts w:ascii="Cambria Math" w:hAnsi="Cambria Math"/>
+                  <w:i/>
+                  <w:lang w:val="en-US"/>
+                </w:rPr>
+              </m:ctrlPr>
+            </m:dPr>
+            <m:e>
+              <m:r>
+                <m:rPr>
+                  <m:sty m:val="bi"/>
+                </m:rPr>
+                <w:rPr>
+                  <w:rFonts w:ascii="Cambria Math" w:hAnsi="Cambria Math"/>
+                  <w:lang w:val="en-US"/>
+                </w:rPr>
+                <m:t>v</m:t>
+              </m:r>
+            </m:e>
+          </m:d>
+          <m:r>
+            <w:rPr>
+              <w:rFonts w:ascii="Cambria Math" w:hAnsi="Cambria Math"/>
+              <w:lang w:val="en-US"/>
+            </w:rPr>
+            <m:t>∙</m:t>
+          </m:r>
+          <m:func>
+            <m:funcPr>
+              <m:ctrlPr>
+                <w:rPr>
+                  <w:rFonts w:ascii="Cambria Math" w:hAnsi="Cambria Math"/>
+                  <w:i/>
+                  <w:lang w:val="en-US"/>
+                </w:rPr>
+              </m:ctrlPr>
+            </m:funcPr>
+            <m:fName>
+              <m:r>
+                <m:rPr>
+                  <m:sty m:val="p"/>
+                </m:rPr>
+                <w:rPr>
+                  <w:rFonts w:ascii="Cambria Math" w:hAnsi="Cambria Math"/>
+                  <w:lang w:val="en-US"/>
+                </w:rPr>
+                <m:t>cos</m:t>
+              </m:r>
+            </m:fName>
+            <m:e>
+              <m:r>
+                <w:rPr>
+                  <w:rFonts w:ascii="Cambria Math" w:hAnsi="Cambria Math"/>
+                  <w:lang w:val="en-US"/>
+                </w:rPr>
+                <m:t>α</m:t>
+              </m:r>
+            </m:e>
+          </m:func>
+        </m:oMath>
+      </m:oMathPara>
+    </w:p>
+    <w:p>
+      <w:pPr>
+        <w:ind w:firstLine="576"/>
+        <w:rPr>
+          <w:rFonts w:eastAsiaTheme="minorEastAsia"/>
+          <w:lang w:val="en-US"/>
+        </w:rPr>
+      </w:pPr>
+      <w:r>
+        <w:rPr>
+          <w:rFonts w:eastAsiaTheme="minorEastAsia"/>
+          <w:lang w:val="en-US"/>
+        </w:rPr>
+        <w:t>Then:</w:t>
+      </w:r>
+    </w:p>
+    <w:p>
+      <w:pPr>
+        <w:ind w:firstLine="576"/>
+        <w:rPr>
+          <w:rFonts w:eastAsiaTheme="minorEastAsia"/>
+          <w:lang w:val="en-US"/>
+        </w:rPr>
+      </w:pPr>
+      <m:oMathPara>
+        <m:oMath>
+          <m:r>
+            <m:rPr>
+              <m:sty m:val="bi"/>
+            </m:rPr>
+            <w:rPr>
+              <w:rFonts w:ascii="Cambria Math" w:hAnsi="Cambria Math"/>
+              <w:lang w:val="en-US"/>
+            </w:rPr>
+            <m:t>U∙V=</m:t>
+          </m:r>
+          <m:f>
+            <m:fPr>
+              <m:ctrlPr>
+                <w:rPr>
+                  <w:rFonts w:ascii="Cambria Math" w:hAnsi="Cambria Math"/>
+                  <w:b/>
+                  <w:bCs/>
+                  <w:i/>
+                  <w:lang w:val="en-US"/>
+                </w:rPr>
+              </m:ctrlPr>
+            </m:fPr>
+            <m:num>
+              <m:r>
+                <m:rPr>
+                  <m:sty m:val="bi"/>
+                </m:rPr>
+                <w:rPr>
+                  <w:rFonts w:ascii="Cambria Math" w:hAnsi="Cambria Math"/>
+                  <w:lang w:val="en-US"/>
+                </w:rPr>
+                <m:t>u</m:t>
+              </m:r>
+              <m:ctrlPr>
+                <w:rPr>
+                  <w:rFonts w:ascii="Cambria Math" w:hAnsi="Cambria Math"/>
+                  <w:i/>
+                  <w:lang w:val="en-US"/>
+                </w:rPr>
+              </m:ctrlPr>
+            </m:num>
+            <m:den>
+              <m:d>
+                <m:dPr>
+                  <m:begChr m:val="‖"/>
+                  <m:endChr m:val="‖"/>
+                  <m:ctrlPr>
+                    <w:rPr>
+                      <w:rFonts w:ascii="Cambria Math" w:hAnsi="Cambria Math"/>
+                      <w:i/>
+                      <w:lang w:val="en-US"/>
+                    </w:rPr>
+                  </m:ctrlPr>
+                </m:dPr>
+                <m:e>
+                  <m:r>
+                    <m:rPr>
+                      <m:sty m:val="bi"/>
+                    </m:rPr>
+                    <w:rPr>
+                      <w:rFonts w:ascii="Cambria Math" w:hAnsi="Cambria Math"/>
+                      <w:lang w:val="en-US"/>
+                    </w:rPr>
+                    <m:t>u</m:t>
+                  </m:r>
+                </m:e>
+              </m:d>
+            </m:den>
+          </m:f>
+          <m:r>
+            <m:rPr>
+              <m:sty m:val="bi"/>
+            </m:rPr>
+            <w:rPr>
+              <w:rFonts w:ascii="Cambria Math" w:hAnsi="Cambria Math"/>
+              <w:lang w:val="en-US"/>
+            </w:rPr>
+            <m:t>∙</m:t>
+          </m:r>
+          <m:f>
+            <m:fPr>
+              <m:ctrlPr>
+                <w:rPr>
+                  <w:rFonts w:ascii="Cambria Math" w:hAnsi="Cambria Math"/>
+                  <w:b/>
+                  <w:bCs/>
+                  <w:i/>
+                  <w:lang w:val="en-US"/>
+                </w:rPr>
+              </m:ctrlPr>
+            </m:fPr>
+            <m:num>
+              <m:r>
+                <m:rPr>
+                  <m:sty m:val="bi"/>
+                </m:rPr>
+                <w:rPr>
+                  <w:rFonts w:ascii="Cambria Math" w:hAnsi="Cambria Math"/>
+                  <w:lang w:val="en-US"/>
+                </w:rPr>
+                <m:t>v</m:t>
+              </m:r>
+              <m:ctrlPr>
+                <w:rPr>
+                  <w:rFonts w:ascii="Cambria Math" w:hAnsi="Cambria Math"/>
+                  <w:i/>
+                  <w:lang w:val="en-US"/>
+                </w:rPr>
+              </m:ctrlPr>
+            </m:num>
+            <m:den>
+              <m:d>
+                <m:dPr>
+                  <m:begChr m:val="‖"/>
+                  <m:endChr m:val="‖"/>
+                  <m:ctrlPr>
+                    <w:rPr>
+                      <w:rFonts w:ascii="Cambria Math" w:hAnsi="Cambria Math"/>
+                      <w:i/>
+                      <w:lang w:val="en-US"/>
+                    </w:rPr>
+                  </m:ctrlPr>
+                </m:dPr>
+                <m:e>
+                  <m:r>
+                    <m:rPr>
+                      <m:sty m:val="bi"/>
+                    </m:rPr>
+                    <w:rPr>
+                      <w:rFonts w:ascii="Cambria Math" w:hAnsi="Cambria Math"/>
+                      <w:lang w:val="en-US"/>
+                    </w:rPr>
+                    <m:t>v</m:t>
+                  </m:r>
+                </m:e>
+              </m:d>
+            </m:den>
+          </m:f>
+          <m:r>
+            <m:rPr>
+              <m:sty m:val="bi"/>
+            </m:rPr>
+            <w:rPr>
+              <w:rFonts w:ascii="Cambria Math" w:hAnsi="Cambria Math"/>
+              <w:lang w:val="en-US"/>
+            </w:rPr>
+            <m:t>=</m:t>
+          </m:r>
+          <m:f>
+            <m:fPr>
+              <m:ctrlPr>
+                <w:rPr>
+                  <w:rFonts w:ascii="Cambria Math" w:hAnsi="Cambria Math"/>
+                  <w:b/>
+                  <w:bCs/>
+                  <w:i/>
+                  <w:lang w:val="en-US"/>
+                </w:rPr>
+              </m:ctrlPr>
+            </m:fPr>
+            <m:num>
+              <m:r>
+                <m:rPr>
+                  <m:sty m:val="bi"/>
+                </m:rPr>
+                <w:rPr>
+                  <w:rFonts w:ascii="Cambria Math" w:hAnsi="Cambria Math"/>
+                  <w:lang w:val="en-US"/>
+                </w:rPr>
+                <m:t>u∙v</m:t>
+              </m:r>
+            </m:num>
+            <m:den>
+              <m:d>
+                <m:dPr>
+                  <m:begChr m:val="‖"/>
+                  <m:endChr m:val="‖"/>
+                  <m:ctrlPr>
+                    <w:rPr>
+                      <w:rFonts w:ascii="Cambria Math" w:hAnsi="Cambria Math"/>
+                      <w:i/>
+                      <w:lang w:val="en-US"/>
+                    </w:rPr>
+                  </m:ctrlPr>
+                </m:dPr>
+                <m:e>
+                  <m:r>
+                    <m:rPr>
+                      <m:sty m:val="bi"/>
+                    </m:rPr>
+                    <w:rPr>
+                      <w:rFonts w:ascii="Cambria Math" w:hAnsi="Cambria Math"/>
+                      <w:lang w:val="en-US"/>
+                    </w:rPr>
+                    <m:t>u</m:t>
+                  </m:r>
+                </m:e>
+              </m:d>
+              <m:d>
+                <m:dPr>
+                  <m:begChr m:val="‖"/>
+                  <m:endChr m:val="‖"/>
+                  <m:ctrlPr>
+                    <w:rPr>
+                      <w:rFonts w:ascii="Cambria Math" w:hAnsi="Cambria Math"/>
+                      <w:i/>
+                      <w:lang w:val="en-US"/>
+                    </w:rPr>
+                  </m:ctrlPr>
+                </m:dPr>
+                <m:e>
+                  <m:r>
+                    <m:rPr>
+                      <m:sty m:val="bi"/>
+                    </m:rPr>
+                    <w:rPr>
+                      <w:rFonts w:ascii="Cambria Math" w:hAnsi="Cambria Math"/>
+                      <w:lang w:val="en-US"/>
+                    </w:rPr>
+                    <m:t>v</m:t>
+                  </m:r>
+                </m:e>
+              </m:d>
+            </m:den>
+          </m:f>
+          <m:r>
+            <m:rPr>
+              <m:sty m:val="bi"/>
+            </m:rPr>
+            <w:rPr>
+              <w:rFonts w:ascii="Cambria Math" w:hAnsi="Cambria Math"/>
+              <w:lang w:val="en-US"/>
+            </w:rPr>
+            <m:t>=</m:t>
+          </m:r>
+          <m:func>
+            <m:funcPr>
+              <m:ctrlPr>
+                <w:rPr>
+                  <w:rFonts w:ascii="Cambria Math" w:hAnsi="Cambria Math"/>
+                  <w:i/>
+                  <w:lang w:val="en-US"/>
+                </w:rPr>
+              </m:ctrlPr>
+            </m:funcPr>
+            <m:fName>
+              <m:r>
+                <m:rPr>
+                  <m:sty m:val="p"/>
+                </m:rPr>
+                <w:rPr>
+                  <w:rFonts w:ascii="Cambria Math" w:hAnsi="Cambria Math"/>
+                  <w:lang w:val="en-US"/>
+                </w:rPr>
+                <m:t>cos</m:t>
+              </m:r>
+              <m:ctrlPr>
+                <w:rPr>
+                  <w:rFonts w:ascii="Cambria Math" w:hAnsi="Cambria Math"/>
+                  <w:b/>
+                  <w:bCs/>
+                  <w:i/>
+                  <w:lang w:val="en-US"/>
+                </w:rPr>
+              </m:ctrlPr>
+            </m:fName>
+            <m:e>
+              <m:r>
+                <w:rPr>
+                  <w:rFonts w:ascii="Cambria Math" w:hAnsi="Cambria Math"/>
+                  <w:lang w:val="en-US"/>
+                </w:rPr>
+                <m:t>α</m:t>
+              </m:r>
+            </m:e>
+          </m:func>
+        </m:oMath>
+      </m:oMathPara>
+    </w:p>
+    <w:p>
+      <w:pPr>
+        <w:ind w:firstLine="576"/>
+        <w:rPr>
+          <w:rFonts w:eastAsiaTheme="minorEastAsia"/>
+          <w:lang w:val="en-US"/>
+        </w:rPr>
+      </w:pPr>
+      <w:r>
+        <w:rPr>
+          <w:rFonts w:eastAsiaTheme="minorEastAsia"/>
+          <w:lang w:val="en-US"/>
+        </w:rPr>
+        <w:t>This means that for any two nonzero vectors this formula applies:</w:t>
+      </w:r>
+    </w:p>
+    <w:p>
+      <w:pPr>
+        <w:ind w:firstLine="576"/>
+        <w:rPr>
+          <w:rFonts w:eastAsiaTheme="minorEastAsia"/>
+          <w:b/>
+          <w:lang w:val="en-US"/>
+        </w:rPr>
+      </w:pPr>
+      <m:oMathPara>
+        <m:oMath>
+          <m:f>
+            <m:fPr>
+              <m:ctrlPr>
+                <w:rPr>
+                  <w:rFonts w:ascii="Cambria Math" w:hAnsi="Cambria Math"/>
+                  <w:b/>
+                  <w:bCs/>
+                  <w:i/>
+                  <w:lang w:val="en-US"/>
+                </w:rPr>
+              </m:ctrlPr>
+            </m:fPr>
+            <m:num>
+              <m:r>
+                <m:rPr>
+                  <m:sty m:val="bi"/>
+                </m:rPr>
+                <w:rPr>
+                  <w:rFonts w:ascii="Cambria Math" w:hAnsi="Cambria Math"/>
+                  <w:lang w:val="en-US"/>
+                </w:rPr>
+                <m:t>u∙v</m:t>
+              </m:r>
+            </m:num>
+            <m:den>
+              <m:d>
+                <m:dPr>
+                  <m:begChr m:val="‖"/>
+                  <m:endChr m:val="‖"/>
+                  <m:ctrlPr>
+                    <w:rPr>
+                      <w:rFonts w:ascii="Cambria Math" w:hAnsi="Cambria Math"/>
+                      <w:i/>
+                      <w:lang w:val="en-US"/>
+                    </w:rPr>
+                  </m:ctrlPr>
+                </m:dPr>
+                <m:e>
+                  <m:r>
+                    <m:rPr>
+                      <m:sty m:val="bi"/>
+                    </m:rPr>
+                    <w:rPr>
+                      <w:rFonts w:ascii="Cambria Math" w:hAnsi="Cambria Math"/>
+                      <w:lang w:val="en-US"/>
+                    </w:rPr>
+                    <m:t>u</m:t>
+                  </m:r>
+                </m:e>
+              </m:d>
+              <m:d>
+                <m:dPr>
+                  <m:begChr m:val="‖"/>
+                  <m:endChr m:val="‖"/>
+                  <m:ctrlPr>
+                    <w:rPr>
+                      <w:rFonts w:ascii="Cambria Math" w:hAnsi="Cambria Math"/>
+                      <w:i/>
+                      <w:lang w:val="en-US"/>
+                    </w:rPr>
+                  </m:ctrlPr>
+                </m:dPr>
+                <m:e>
+                  <m:r>
+                    <m:rPr>
+                      <m:sty m:val="bi"/>
+                    </m:rPr>
+                    <w:rPr>
+                      <w:rFonts w:ascii="Cambria Math" w:hAnsi="Cambria Math"/>
+                      <w:lang w:val="en-US"/>
+                    </w:rPr>
+                    <m:t>v</m:t>
+                  </m:r>
+                </m:e>
+              </m:d>
+            </m:den>
+          </m:f>
+          <m:r>
+            <m:rPr>
+              <m:sty m:val="bi"/>
+            </m:rPr>
+            <w:rPr>
+              <w:rFonts w:ascii="Cambria Math" w:hAnsi="Cambria Math"/>
+              <w:lang w:val="en-US"/>
+            </w:rPr>
+            <m:t>=</m:t>
+          </m:r>
+        </m:oMath>
+      </m:oMathPara>
+    </w:p>
+    <w:p>
+      <w:pPr>
+        <w:ind w:firstLine="576"/>
+        <w:rPr>
+          <w:rFonts w:eastAsiaTheme="minorEastAsia"/>
+          <w:lang w:val="en-US"/>
+        </w:rPr>
+      </w:pPr>
+      <m:oMathPara>
+        <m:oMath>
+          <m:func>
+            <m:funcPr>
+              <m:ctrlPr>
+                <w:rPr>
+                  <w:rFonts w:ascii="Cambria Math" w:hAnsi="Cambria Math"/>
+                  <w:i/>
+                  <w:lang w:val="en-US"/>
+                </w:rPr>
+              </m:ctrlPr>
+            </m:funcPr>
+            <m:fName>
+              <m:r>
+                <m:rPr>
+                  <m:sty m:val="p"/>
+                </m:rPr>
+                <w:rPr>
+                  <w:rFonts w:ascii="Cambria Math" w:hAnsi="Cambria Math"/>
+                  <w:lang w:val="en-US"/>
+                </w:rPr>
+                <m:t>cos</m:t>
+              </m:r>
+              <m:ctrlPr>
+                <w:rPr>
+                  <w:rFonts w:ascii="Cambria Math" w:hAnsi="Cambria Math"/>
+                  <w:b/>
+                  <w:bCs/>
+                  <w:i/>
+                  <w:lang w:val="en-US"/>
+                </w:rPr>
+              </m:ctrlPr>
+            </m:fName>
+            <m:e>
+              <m:r>
+                <w:rPr>
+                  <w:rFonts w:ascii="Cambria Math" w:hAnsi="Cambria Math"/>
+                  <w:lang w:val="en-US"/>
+                </w:rPr>
+                <m:t>α</m:t>
+              </m:r>
+            </m:e>
+          </m:func>
+        </m:oMath>
+      </m:oMathPara>
+    </w:p>
+    <w:p>
+      <w:pPr>
+        <w:ind w:firstLine="576"/>
+        <w:rPr>
+          <w:rFonts w:eastAsiaTheme="minorEastAsia"/>
+          <w:lang w:val="en-US"/>
+        </w:rPr>
+      </w:pPr>
+      <w:r>
+        <w:rPr>
+          <w:rFonts w:eastAsiaTheme="minorEastAsia"/>
+          <w:lang w:val="en-US"/>
+        </w:rPr>
+        <w:t xml:space="preserve">We know that </w:t>
+      </w:r>
+      <w:r>
+        <w:rPr>
+          <w:rFonts w:eastAsiaTheme="minorEastAsia"/>
+          <w:lang w:val="en-US"/>
+        </w:rPr>
+        <w:t xml:space="preserve">the </w:t>
+      </w:r>
+      <w:r>
+        <w:rPr>
+          <w:rFonts w:eastAsiaTheme="minorEastAsia"/>
+          <w:lang w:val="en-US"/>
+        </w:rPr>
+        <w:t>cosine definition is</w:t>
+      </w:r>
+    </w:p>
+    <w:p>
+      <w:pPr>
+        <w:ind w:firstLine="576"/>
+        <w:rPr>
+          <w:rFonts w:eastAsiaTheme="minorEastAsia"/>
+          <w:lang w:val="en-US"/>
+        </w:rPr>
+      </w:pPr>
+      <m:oMathPara>
+        <m:oMath>
+          <m:func>
+            <m:funcPr>
+              <m:ctrlPr>
+                <w:rPr>
+                  <w:rFonts w:ascii="Cambria Math" w:eastAsiaTheme="minorEastAsia" w:hAnsi="Cambria Math"/>
+                  <w:i/>
+                  <w:lang w:val="en-US"/>
+                </w:rPr>
+              </m:ctrlPr>
+            </m:funcPr>
+            <m:fName>
+              <m:r>
+                <m:rPr>
+                  <m:sty m:val="p"/>
+                </m:rPr>
+                <w:rPr>
+                  <w:rFonts w:ascii="Cambria Math" w:eastAsiaTheme="minorEastAsia" w:hAnsi="Cambria Math"/>
+                  <w:lang w:val="en-US"/>
+                </w:rPr>
+                <m:t>cos</m:t>
+              </m:r>
+            </m:fName>
+            <m:e>
+              <m:r>
+                <w:rPr>
+                  <w:rFonts w:ascii="Cambria Math" w:eastAsiaTheme="minorEastAsia" w:hAnsi="Cambria Math"/>
+                  <w:lang w:val="en-US"/>
+                </w:rPr>
+                <m:t>α</m:t>
+              </m:r>
+            </m:e>
+          </m:func>
+          <m:r>
+            <w:rPr>
+              <w:rFonts w:ascii="Cambria Math" w:eastAsiaTheme="minorEastAsia" w:hAnsi="Cambria Math"/>
+              <w:lang w:val="en-US"/>
+            </w:rPr>
+            <m:t>∈</m:t>
+          </m:r>
+          <m:d>
+            <m:dPr>
+              <m:begChr m:val="["/>
+              <m:endChr m:val="]"/>
+              <m:ctrlPr>
+                <w:rPr>
+                  <w:rFonts w:ascii="Cambria Math" w:eastAsiaTheme="minorEastAsia" w:hAnsi="Cambria Math"/>
+                  <w:i/>
+                  <w:lang w:val="en-US"/>
+                </w:rPr>
+              </m:ctrlPr>
+            </m:dPr>
+            <m:e>
+              <m:r>
+                <w:rPr>
+                  <w:rFonts w:ascii="Cambria Math" w:eastAsiaTheme="minorEastAsia" w:hAnsi="Cambria Math"/>
+                  <w:lang w:val="en-US"/>
+                </w:rPr>
+                <m:t>-1, 1</m:t>
+              </m:r>
+            </m:e>
+          </m:d>
+          <m:r>
+            <w:rPr>
+              <w:rFonts w:ascii="Cambria Math" w:eastAsiaTheme="minorEastAsia" w:hAnsi="Cambria Math"/>
+              <w:lang w:val="en-US"/>
+            </w:rPr>
+            <m:t xml:space="preserve"> ∀ α∈(-∞, ∞)</m:t>
+          </m:r>
+        </m:oMath>
+      </m:oMathPara>
+    </w:p>
+    <w:p>
+      <w:pPr>
+        <w:ind w:firstLine="576"/>
+        <w:rPr>
+          <w:rFonts w:eastAsiaTheme="minorEastAsia"/>
+          <w:lang w:val="en-US"/>
+        </w:rPr>
+      </w:pPr>
+      <m:oMathPara>
+        <m:oMath>
+          <m:r>
+            <w:rPr>
+              <w:rFonts w:ascii="Cambria Math" w:eastAsiaTheme="minorEastAsia" w:hAnsi="Cambria Math"/>
+              <w:lang w:val="en-US"/>
+            </w:rPr>
+            <m:t>cos</m:t>
+          </m:r>
+          <m:r>
+            <m:rPr>
+              <m:scr m:val="double-struck"/>
+            </m:rPr>
+            <w:rPr>
+              <w:rFonts w:ascii="Cambria Math" w:eastAsiaTheme="minorEastAsia" w:hAnsi="Cambria Math"/>
+              <w:lang w:val="en-US"/>
+            </w:rPr>
+            <m:t xml:space="preserve"> :R→[-</m:t>
+          </m:r>
+          <m:r>
+            <w:rPr>
+              <w:rFonts w:ascii="Cambria Math" w:eastAsiaTheme="minorEastAsia" w:hAnsi="Cambria Math"/>
+              <w:lang w:val="en-US"/>
+            </w:rPr>
+            <m:t>1,1]</m:t>
+          </m:r>
+        </m:oMath>
+      </m:oMathPara>
+    </w:p>
+    <w:p>
+      <w:pPr>
+        <w:ind w:firstLine="576"/>
+        <w:rPr>
+          <w:rFonts w:eastAsiaTheme="minorEastAsia"/>
+          <w:lang w:val="en-US"/>
+        </w:rPr>
+      </w:pPr>
+      <w:r>
+        <w:rPr>
+          <w:rFonts w:eastAsiaTheme="minorEastAsia"/>
+          <w:lang w:val="en-US"/>
+        </w:rPr>
+        <w:t>This means:</w:t>
+      </w:r>
+    </w:p>
+    <w:p>
+      <w:pPr>
+        <w:ind w:firstLine="576"/>
+        <w:rPr>
+          <w:rFonts w:eastAsiaTheme="minorEastAsia"/>
+          <w:lang w:val="en-US"/>
+        </w:rPr>
+      </w:pPr>
+      <m:oMathPara>
+        <m:oMath>
+          <m:r>
+            <w:rPr>
+              <w:rFonts w:ascii="Cambria Math" w:eastAsiaTheme="minorEastAsia" w:hAnsi="Cambria Math"/>
+              <w:lang w:val="en-US"/>
+            </w:rPr>
+            <m:t>-1</m:t>
+          </m:r>
+          <m:r>
+            <m:rPr>
+              <m:sty m:val="bi"/>
+            </m:rPr>
+            <w:rPr>
+              <w:rFonts w:ascii="Cambria Math" w:eastAsiaTheme="minorEastAsia" w:hAnsi="Cambria Math"/>
+              <w:lang w:val="en-US"/>
+            </w:rPr>
+            <m:t>≤</m:t>
+          </m:r>
+          <m:f>
+            <m:fPr>
+              <m:ctrlPr>
+                <w:rPr>
+                  <w:rFonts w:ascii="Cambria Math" w:hAnsi="Cambria Math"/>
+                  <w:b/>
+                  <w:bCs/>
+                  <w:i/>
+                  <w:lang w:val="en-US"/>
+                </w:rPr>
+              </m:ctrlPr>
+            </m:fPr>
+            <m:num>
+              <m:r>
+                <m:rPr>
+                  <m:sty m:val="bi"/>
+                </m:rPr>
+                <w:rPr>
+                  <w:rFonts w:ascii="Cambria Math" w:hAnsi="Cambria Math"/>
+                  <w:lang w:val="en-US"/>
+                </w:rPr>
+                <m:t>u∙v</m:t>
+              </m:r>
+            </m:num>
+            <m:den>
+              <m:d>
+                <m:dPr>
+                  <m:begChr m:val="‖"/>
+                  <m:endChr m:val="‖"/>
+                  <m:ctrlPr>
+                    <w:rPr>
+                      <w:rFonts w:ascii="Cambria Math" w:hAnsi="Cambria Math"/>
+                      <w:i/>
+                      <w:lang w:val="en-US"/>
+                    </w:rPr>
+                  </m:ctrlPr>
+                </m:dPr>
+                <m:e>
+                  <m:r>
+                    <m:rPr>
+                      <m:sty m:val="bi"/>
+                    </m:rPr>
+                    <w:rPr>
+                      <w:rFonts w:ascii="Cambria Math" w:hAnsi="Cambria Math"/>
+                      <w:lang w:val="en-US"/>
+                    </w:rPr>
+                    <m:t>u</m:t>
+                  </m:r>
+                </m:e>
+              </m:d>
+              <m:d>
+                <m:dPr>
+                  <m:begChr m:val="‖"/>
+                  <m:endChr m:val="‖"/>
+                  <m:ctrlPr>
+                    <w:rPr>
+                      <w:rFonts w:ascii="Cambria Math" w:hAnsi="Cambria Math"/>
+                      <w:i/>
+                      <w:lang w:val="en-US"/>
+                    </w:rPr>
+                  </m:ctrlPr>
+                </m:dPr>
+                <m:e>
+                  <m:r>
+                    <m:rPr>
+                      <m:sty m:val="bi"/>
+                    </m:rPr>
+                    <w:rPr>
+                      <w:rFonts w:ascii="Cambria Math" w:hAnsi="Cambria Math"/>
+                      <w:lang w:val="en-US"/>
+                    </w:rPr>
+                    <m:t>v</m:t>
+                  </m:r>
+                </m:e>
+              </m:d>
+            </m:den>
+          </m:f>
+          <m:r>
+            <w:rPr>
+              <w:rFonts w:ascii="Cambria Math" w:eastAsiaTheme="minorEastAsia" w:hAnsi="Cambria Math"/>
+              <w:lang w:val="en-US"/>
+            </w:rPr>
+            <m:t>≤1</m:t>
+          </m:r>
+        </m:oMath>
+      </m:oMathPara>
+    </w:p>
+    <w:p>
+      <w:pPr>
+        <w:ind w:firstLine="576"/>
+        <w:rPr>
+          <w:rFonts w:eastAsiaTheme="minorEastAsia"/>
+          <w:lang w:val="en-US"/>
+        </w:rPr>
+      </w:pPr>
+      <m:oMathPara>
+        <m:oMath>
+          <m:d>
+            <m:dPr>
+              <m:begChr m:val="|"/>
+              <m:endChr m:val="|"/>
+              <m:ctrlPr>
+                <w:rPr>
+                  <w:rFonts w:ascii="Cambria Math" w:eastAsiaTheme="minorEastAsia" w:hAnsi="Cambria Math"/>
+                  <w:i/>
+                  <w:lang w:val="en-US"/>
+                </w:rPr>
+              </m:ctrlPr>
+            </m:dPr>
+            <m:e>
+              <m:f>
+                <m:fPr>
+                  <m:ctrlPr>
+                    <w:rPr>
+                      <w:rFonts w:ascii="Cambria Math" w:hAnsi="Cambria Math"/>
+                      <w:b/>
+                      <w:bCs/>
+                      <w:i/>
+                      <w:lang w:val="en-US"/>
+                    </w:rPr>
+                  </m:ctrlPr>
+                </m:fPr>
+                <m:num>
+                  <m:r>
+                    <m:rPr>
+                      <m:sty m:val="bi"/>
+                    </m:rPr>
+                    <w:rPr>
+                      <w:rFonts w:ascii="Cambria Math" w:hAnsi="Cambria Math"/>
+                      <w:lang w:val="en-US"/>
+                    </w:rPr>
+                    <m:t>u∙v</m:t>
+                  </m:r>
+                </m:num>
+                <m:den>
+                  <m:d>
+                    <m:dPr>
+                      <m:begChr m:val="‖"/>
+                      <m:endChr m:val="‖"/>
+                      <m:ctrlPr>
+                        <w:rPr>
+                          <w:rFonts w:ascii="Cambria Math" w:hAnsi="Cambria Math"/>
+                          <w:i/>
+                          <w:lang w:val="en-US"/>
+                        </w:rPr>
+                      </m:ctrlPr>
+                    </m:dPr>
+                    <m:e>
+                      <m:r>
+                        <m:rPr>
+                          <m:sty m:val="bi"/>
+                        </m:rPr>
+                        <w:rPr>
+                          <w:rFonts w:ascii="Cambria Math" w:hAnsi="Cambria Math"/>
+                          <w:lang w:val="en-US"/>
+                        </w:rPr>
+                        <m:t>u</m:t>
+                      </m:r>
+                    </m:e>
+                  </m:d>
+                  <m:d>
+                    <m:dPr>
+                      <m:begChr m:val="‖"/>
+                      <m:endChr m:val="‖"/>
+                      <m:ctrlPr>
+                        <w:rPr>
+                          <w:rFonts w:ascii="Cambria Math" w:hAnsi="Cambria Math"/>
+                          <w:i/>
+                          <w:lang w:val="en-US"/>
+                        </w:rPr>
+                      </m:ctrlPr>
+                    </m:dPr>
+                    <m:e>
+                      <m:r>
+                        <m:rPr>
+                          <m:sty m:val="bi"/>
+                        </m:rPr>
+                        <w:rPr>
+                          <w:rFonts w:ascii="Cambria Math" w:hAnsi="Cambria Math"/>
+                          <w:lang w:val="en-US"/>
+                        </w:rPr>
+                        <m:t>v</m:t>
+                      </m:r>
+                    </m:e>
+                  </m:d>
+                </m:den>
+              </m:f>
+            </m:e>
+          </m:d>
+          <m:r>
+            <w:rPr>
+              <w:rFonts w:ascii="Cambria Math" w:eastAsiaTheme="minorEastAsia" w:hAnsi="Cambria Math"/>
+              <w:lang w:val="en-US"/>
+            </w:rPr>
+            <m:t>≤1</m:t>
+          </m:r>
+        </m:oMath>
+      </m:oMathPara>
+    </w:p>
+    <w:p>
+      <w:pPr>
+        <w:ind w:firstLine="576"/>
+        <w:rPr>
+          <w:rFonts w:eastAsiaTheme="minorEastAsia"/>
+          <w:lang w:val="en-US"/>
+        </w:rPr>
+      </w:pPr>
+      <w:r>
+        <w:rPr>
+          <w:rFonts w:eastAsiaTheme="minorEastAsia"/>
+          <w:lang w:val="en-US"/>
+        </w:rPr>
+        <w:t>The Schwartz Inequality is:</w:t>
+      </w:r>
+    </w:p>
+    <w:p>
+      <w:pPr>
+        <w:ind w:firstLine="576"/>
+        <w:rPr>
+          <w:rFonts w:eastAsiaTheme="minorEastAsia"/>
+          <w:lang w:val="en-US"/>
+        </w:rPr>
+      </w:pPr>
+      <m:oMathPara>
+        <m:oMath>
+          <m:d>
+            <m:dPr>
+              <m:begChr m:val="|"/>
+              <m:endChr m:val="|"/>
+              <m:ctrlPr>
+                <w:rPr>
+                  <w:rFonts w:ascii="Cambria Math" w:eastAsiaTheme="minorEastAsia" w:hAnsi="Cambria Math"/>
+                  <w:i/>
+                  <w:lang w:val="en-US"/>
+                </w:rPr>
+              </m:ctrlPr>
+            </m:dPr>
+            <m:e>
+              <m:r>
+                <m:rPr>
+                  <m:sty m:val="bi"/>
+                </m:rPr>
+                <w:rPr>
+                  <w:rFonts w:ascii="Cambria Math" w:hAnsi="Cambria Math"/>
+                  <w:lang w:val="en-US"/>
+                </w:rPr>
+                <m:t>u∙v</m:t>
+              </m:r>
+            </m:e>
+          </m:d>
+          <m:r>
+            <w:rPr>
+              <w:rFonts w:ascii="Cambria Math" w:eastAsiaTheme="minorEastAsia" w:hAnsi="Cambria Math"/>
+              <w:lang w:val="en-US"/>
+            </w:rPr>
+            <m:t>≤</m:t>
+          </m:r>
+          <m:d>
+            <m:dPr>
+              <m:begChr m:val="‖"/>
+              <m:endChr m:val="‖"/>
+              <m:ctrlPr>
+                <w:rPr>
+                  <w:rFonts w:ascii="Cambria Math" w:hAnsi="Cambria Math"/>
+                  <w:i/>
+                  <w:lang w:val="en-US"/>
+                </w:rPr>
+              </m:ctrlPr>
+            </m:dPr>
+            <m:e>
+              <m:r>
+                <m:rPr>
+                  <m:sty m:val="bi"/>
+                </m:rPr>
+                <w:rPr>
+                  <w:rFonts w:ascii="Cambria Math" w:hAnsi="Cambria Math"/>
+                  <w:lang w:val="en-US"/>
+                </w:rPr>
+                <m:t>u</m:t>
+              </m:r>
+            </m:e>
+          </m:d>
+          <m:d>
+            <m:dPr>
+              <m:begChr m:val="‖"/>
+              <m:endChr m:val="‖"/>
+              <m:ctrlPr>
+                <w:rPr>
+                  <w:rFonts w:ascii="Cambria Math" w:hAnsi="Cambria Math"/>
+                  <w:i/>
+                  <w:lang w:val="en-US"/>
+                </w:rPr>
+              </m:ctrlPr>
+            </m:dPr>
+            <m:e>
+              <m:r>
+                <m:rPr>
+                  <m:sty m:val="bi"/>
+                </m:rPr>
+                <w:rPr>
+                  <w:rFonts w:ascii="Cambria Math" w:hAnsi="Cambria Math"/>
+                  <w:lang w:val="en-US"/>
+                </w:rPr>
+                <m:t>v</m:t>
+              </m:r>
+            </m:e>
+          </m:d>
+        </m:oMath>
+      </m:oMathPara>
+    </w:p>
+    <w:p>
+      <w:pPr>
         <w:pStyle w:val="Heading1"/>
         <w:rPr>
           <w:lang w:val="en-US"/>
@@ -8730,19 +13115,12 @@
           <w:lang w:val="en-US"/>
         </w:rPr>
         <w:object w:dxaOrig="5537" w:dyaOrig="5134" w14:anchorId="282D5516">
-          <v:shape id="_x0000_i1026" type="#_x0000_t75" style="width:370.5pt;height:344.25pt" o:ole="">
-            <v:imagedata r:id="rId8" o:title=""/>
+          <v:shape id="_x0000_i1028" type="#_x0000_t75" style="width:370.65pt;height:344.35pt" o:ole="">
+            <v:imagedata r:id="rId12" o:title=""/>
           </v:shape>
-          <o:OLEObject Type="Embed" ProgID="AxGlyph.Document" ShapeID="_x0000_i1026" DrawAspect="Content" ObjectID="_1821804071" r:id="rId9"/>
+          <o:OLEObject Type="Embed" ProgID="AxGlyph.Document" ShapeID="_x0000_i1028" DrawAspect="Content" ObjectID="_1830868621" r:id="rId13"/>
         </w:object>
       </w:r>
-    </w:p>
-    <w:p>
-      <w:pPr>
-        <w:rPr>
-          <w:lang w:val="en-US"/>
-        </w:rPr>
-      </w:pPr>
     </w:p>
     <w:sectPr>
       <w:pgSz w:w="12240" w:h="15840"/>
@@ -9356,7 +13734,7 @@
     <w:link w:val="Heading1Char"/>
     <w:uiPriority w:val="9"/>
     <w:qFormat/>
-    <w:rsid w:val="00C62B7C"/>
+    <w:rsid w:val="00120A9D"/>
     <w:pPr>
       <w:keepNext/>
       <w:keepLines/>
@@ -9368,6 +13746,7 @@
     </w:pPr>
     <w:rPr>
       <w:rFonts w:asciiTheme="majorHAnsi" w:eastAsiaTheme="majorEastAsia" w:hAnsiTheme="majorHAnsi" w:cstheme="majorBidi"/>
+      <w:color w:val="538135" w:themeColor="accent6" w:themeShade="BF"/>
       <w:sz w:val="40"/>
       <w:szCs w:val="40"/>
     </w:rPr>
@@ -9380,7 +13759,7 @@
     <w:uiPriority w:val="9"/>
     <w:unhideWhenUsed/>
     <w:qFormat/>
-    <w:rsid w:val="005D1B1B"/>
+    <w:rsid w:val="00120A9D"/>
     <w:pPr>
       <w:keepNext/>
       <w:keepLines/>
@@ -9393,6 +13772,7 @@
     </w:pPr>
     <w:rPr>
       <w:rFonts w:asciiTheme="majorHAnsi" w:eastAsiaTheme="majorEastAsia" w:hAnsiTheme="majorHAnsi" w:cstheme="majorBidi"/>
+      <w:color w:val="538135" w:themeColor="accent6" w:themeShade="BF"/>
       <w:sz w:val="32"/>
       <w:szCs w:val="32"/>
     </w:rPr>
@@ -9403,10 +13783,9 @@
     <w:next w:val="Normal"/>
     <w:link w:val="Heading3Char"/>
     <w:uiPriority w:val="9"/>
-    <w:semiHidden/>
     <w:unhideWhenUsed/>
     <w:qFormat/>
-    <w:rsid w:val="00792362"/>
+    <w:rsid w:val="00120A9D"/>
     <w:pPr>
       <w:keepNext/>
       <w:keepLines/>
@@ -9419,7 +13798,7 @@
     </w:pPr>
     <w:rPr>
       <w:rFonts w:eastAsiaTheme="majorEastAsia" w:cstheme="majorBidi"/>
-      <w:color w:val="2F5496" w:themeColor="accent1" w:themeShade="BF"/>
+      <w:color w:val="538135" w:themeColor="accent6" w:themeShade="BF"/>
       <w:sz w:val="28"/>
       <w:szCs w:val="28"/>
     </w:rPr>
@@ -9612,9 +13991,10 @@
     <w:basedOn w:val="DefaultParagraphFont"/>
     <w:link w:val="Heading1"/>
     <w:uiPriority w:val="9"/>
-    <w:rsid w:val="00C62B7C"/>
+    <w:rsid w:val="00120A9D"/>
     <w:rPr>
       <w:rFonts w:asciiTheme="majorHAnsi" w:eastAsiaTheme="majorEastAsia" w:hAnsiTheme="majorHAnsi" w:cstheme="majorBidi"/>
+      <w:color w:val="538135" w:themeColor="accent6" w:themeShade="BF"/>
       <w:sz w:val="40"/>
       <w:szCs w:val="40"/>
     </w:rPr>
@@ -9624,9 +14004,10 @@
     <w:basedOn w:val="DefaultParagraphFont"/>
     <w:link w:val="Heading2"/>
     <w:uiPriority w:val="9"/>
-    <w:rsid w:val="005D1B1B"/>
+    <w:rsid w:val="00120A9D"/>
     <w:rPr>
       <w:rFonts w:asciiTheme="majorHAnsi" w:eastAsiaTheme="majorEastAsia" w:hAnsiTheme="majorHAnsi" w:cstheme="majorBidi"/>
+      <w:color w:val="538135" w:themeColor="accent6" w:themeShade="BF"/>
       <w:sz w:val="32"/>
       <w:szCs w:val="32"/>
     </w:rPr>
@@ -9636,11 +14017,10 @@
     <w:basedOn w:val="DefaultParagraphFont"/>
     <w:link w:val="Heading3"/>
     <w:uiPriority w:val="9"/>
-    <w:semiHidden/>
-    <w:rsid w:val="00792362"/>
+    <w:rsid w:val="00120A9D"/>
     <w:rPr>
       <w:rFonts w:eastAsiaTheme="majorEastAsia" w:cstheme="majorBidi"/>
-      <w:color w:val="2F5496" w:themeColor="accent1" w:themeShade="BF"/>
+      <w:color w:val="538135" w:themeColor="accent6" w:themeShade="BF"/>
       <w:sz w:val="28"/>
       <w:szCs w:val="28"/>
     </w:rPr>

</xml_diff>